<commit_message>
Clothing Pureref and GDD Additions
Added the Clothing Pureref.

Added Jackets Holsters and Bag descriptions to Tables in GDD
</commit_message>
<xml_diff>
--- a/PostMortGDD.docx
+++ b/PostMortGDD.docx
@@ -42,7 +42,7 @@
                         <a:effectLst/>
                         <a:extLst>
                           <a:ext uri="{C572A759-6A51-4108-AA02-DFA0A04FC94B}">
-                            <ma14:wrappingTextBoxFlag xmlns:ma14="http://schemas.microsoft.com/office/mac/drawingml/2011/main" xmlns:a14="http://schemas.microsoft.com/office/drawing/2010/main" xmlns:pic="http://schemas.openxmlformats.org/drawingml/2006/picture" xmlns:w="http://schemas.openxmlformats.org/wordprocessingml/2006/main" xmlns:w10="urn:schemas-microsoft-com:office:word" xmlns:v="urn:schemas-microsoft-com:vml" xmlns:o="urn:schemas-microsoft-com:office:office" xmlns:mv="urn:schemas-microsoft-com:mac:vml" xmlns:mo="http://schemas.microsoft.com/office/mac/office/2008/main" xmlns="" xmlns:arto="http://schemas.microsoft.com/office/word/2006/arto"/>
+                            <ma14:wrappingTextBoxFlag xmlns:arto="http://schemas.microsoft.com/office/word/2006/arto" xmlns="" xmlns:mo="http://schemas.microsoft.com/office/mac/office/2008/main" xmlns:mv="urn:schemas-microsoft-com:mac:vml" xmlns:o="urn:schemas-microsoft-com:office:office" xmlns:v="urn:schemas-microsoft-com:vml" xmlns:w10="urn:schemas-microsoft-com:office:word" xmlns:w="http://schemas.openxmlformats.org/wordprocessingml/2006/main" xmlns:pic="http://schemas.openxmlformats.org/drawingml/2006/picture" xmlns:a14="http://schemas.microsoft.com/office/drawing/2010/main" xmlns:ma14="http://schemas.microsoft.com/office/mac/drawingml/2011/main"/>
                           </a:ext>
                         </a:extLst>
                       </wps:spPr>
@@ -178,7 +178,7 @@
                         <a:effectLst/>
                         <a:extLst>
                           <a:ext uri="{C572A759-6A51-4108-AA02-DFA0A04FC94B}">
-                            <ma14:wrappingTextBoxFlag xmlns:ma14="http://schemas.microsoft.com/office/mac/drawingml/2011/main" xmlns:a14="http://schemas.microsoft.com/office/drawing/2010/main" xmlns:pic="http://schemas.openxmlformats.org/drawingml/2006/picture" xmlns:w="http://schemas.openxmlformats.org/wordprocessingml/2006/main" xmlns:w10="urn:schemas-microsoft-com:office:word" xmlns:v="urn:schemas-microsoft-com:vml" xmlns:o="urn:schemas-microsoft-com:office:office" xmlns:mv="urn:schemas-microsoft-com:mac:vml" xmlns:mo="http://schemas.microsoft.com/office/mac/office/2008/main" xmlns="" xmlns:arto="http://schemas.microsoft.com/office/word/2006/arto"/>
+                            <ma14:wrappingTextBoxFlag xmlns:arto="http://schemas.microsoft.com/office/word/2006/arto" xmlns="" xmlns:mo="http://schemas.microsoft.com/office/mac/office/2008/main" xmlns:mv="urn:schemas-microsoft-com:mac:vml" xmlns:o="urn:schemas-microsoft-com:office:office" xmlns:v="urn:schemas-microsoft-com:vml" xmlns:w10="urn:schemas-microsoft-com:office:word" xmlns:w="http://schemas.openxmlformats.org/wordprocessingml/2006/main" xmlns:pic="http://schemas.openxmlformats.org/drawingml/2006/picture" xmlns:a14="http://schemas.microsoft.com/office/drawing/2010/main" xmlns:ma14="http://schemas.microsoft.com/office/mac/drawingml/2011/main"/>
                           </a:ext>
                         </a:extLst>
                       </wps:spPr>
@@ -337,7 +337,7 @@
                         <a:effectLst/>
                         <a:extLst>
                           <a:ext uri="{C572A759-6A51-4108-AA02-DFA0A04FC94B}">
-                            <ma14:wrappingTextBoxFlag xmlns:ma14="http://schemas.microsoft.com/office/mac/drawingml/2011/main" xmlns:a14="http://schemas.microsoft.com/office/drawing/2010/main" xmlns:pic="http://schemas.openxmlformats.org/drawingml/2006/picture" xmlns:w="http://schemas.openxmlformats.org/wordprocessingml/2006/main" xmlns:w10="urn:schemas-microsoft-com:office:word" xmlns:v="urn:schemas-microsoft-com:vml" xmlns:o="urn:schemas-microsoft-com:office:office" xmlns:mv="urn:schemas-microsoft-com:mac:vml" xmlns:mo="http://schemas.microsoft.com/office/mac/office/2008/main" xmlns="" xmlns:arto="http://schemas.microsoft.com/office/word/2006/arto"/>
+                            <ma14:wrappingTextBoxFlag xmlns:arto="http://schemas.microsoft.com/office/word/2006/arto" xmlns="" xmlns:mo="http://schemas.microsoft.com/office/mac/office/2008/main" xmlns:mv="urn:schemas-microsoft-com:mac:vml" xmlns:o="urn:schemas-microsoft-com:office:office" xmlns:v="urn:schemas-microsoft-com:vml" xmlns:w10="urn:schemas-microsoft-com:office:word" xmlns:w="http://schemas.openxmlformats.org/wordprocessingml/2006/main" xmlns:pic="http://schemas.openxmlformats.org/drawingml/2006/picture" xmlns:a14="http://schemas.microsoft.com/office/drawing/2010/main" xmlns:ma14="http://schemas.microsoft.com/office/mac/drawingml/2011/main"/>
                           </a:ext>
                         </a:extLst>
                       </wps:spPr>
@@ -480,7 +480,7 @@
                         <a:effectLst/>
                         <a:extLst>
                           <a:ext uri="{C572A759-6A51-4108-AA02-DFA0A04FC94B}">
-                            <ma14:wrappingTextBoxFlag xmlns:ma14="http://schemas.microsoft.com/office/mac/drawingml/2011/main" xmlns:a14="http://schemas.microsoft.com/office/drawing/2010/main" xmlns:pic="http://schemas.openxmlformats.org/drawingml/2006/picture" xmlns:w="http://schemas.openxmlformats.org/wordprocessingml/2006/main" xmlns:w10="urn:schemas-microsoft-com:office:word" xmlns:v="urn:schemas-microsoft-com:vml" xmlns:o="urn:schemas-microsoft-com:office:office" xmlns:mv="urn:schemas-microsoft-com:mac:vml" xmlns:mo="http://schemas.microsoft.com/office/mac/office/2008/main" xmlns="" xmlns:arto="http://schemas.microsoft.com/office/word/2006/arto"/>
+                            <ma14:wrappingTextBoxFlag xmlns:arto="http://schemas.microsoft.com/office/word/2006/arto" xmlns="" xmlns:mo="http://schemas.microsoft.com/office/mac/office/2008/main" xmlns:mv="urn:schemas-microsoft-com:mac:vml" xmlns:o="urn:schemas-microsoft-com:office:office" xmlns:v="urn:schemas-microsoft-com:vml" xmlns:w10="urn:schemas-microsoft-com:office:word" xmlns:w="http://schemas.openxmlformats.org/wordprocessingml/2006/main" xmlns:pic="http://schemas.openxmlformats.org/drawingml/2006/picture" xmlns:a14="http://schemas.microsoft.com/office/drawing/2010/main" xmlns:ma14="http://schemas.microsoft.com/office/mac/drawingml/2011/main"/>
                           </a:ext>
                         </a:extLst>
                       </wps:spPr>
@@ -701,7 +701,7 @@
                         <a:effectLst/>
                         <a:extLst>
                           <a:ext uri="{C572A759-6A51-4108-AA02-DFA0A04FC94B}">
-                            <ma14:wrappingTextBoxFlag xmlns:ma14="http://schemas.microsoft.com/office/mac/drawingml/2011/main" xmlns:a14="http://schemas.microsoft.com/office/drawing/2010/main" xmlns:pic="http://schemas.openxmlformats.org/drawingml/2006/picture" xmlns:w="http://schemas.openxmlformats.org/wordprocessingml/2006/main" xmlns:w10="urn:schemas-microsoft-com:office:word" xmlns:v="urn:schemas-microsoft-com:vml" xmlns:o="urn:schemas-microsoft-com:office:office" xmlns:mv="urn:schemas-microsoft-com:mac:vml" xmlns:mo="http://schemas.microsoft.com/office/mac/office/2008/main" xmlns="" xmlns:arto="http://schemas.microsoft.com/office/word/2006/arto"/>
+                            <ma14:wrappingTextBoxFlag xmlns:arto="http://schemas.microsoft.com/office/word/2006/arto" xmlns="" xmlns:mo="http://schemas.microsoft.com/office/mac/office/2008/main" xmlns:mv="urn:schemas-microsoft-com:mac:vml" xmlns:o="urn:schemas-microsoft-com:office:office" xmlns:v="urn:schemas-microsoft-com:vml" xmlns:w10="urn:schemas-microsoft-com:office:word" xmlns:w="http://schemas.openxmlformats.org/wordprocessingml/2006/main" xmlns:pic="http://schemas.openxmlformats.org/drawingml/2006/picture" xmlns:a14="http://schemas.microsoft.com/office/drawing/2010/main" xmlns:ma14="http://schemas.microsoft.com/office/mac/drawingml/2011/main"/>
                           </a:ext>
                         </a:extLst>
                       </wps:spPr>
@@ -870,7 +870,7 @@
                         <a:effectLst/>
                         <a:extLst>
                           <a:ext uri="{C572A759-6A51-4108-AA02-DFA0A04FC94B}">
-                            <ma14:wrappingTextBoxFlag xmlns:ma14="http://schemas.microsoft.com/office/mac/drawingml/2011/main" xmlns:a14="http://schemas.microsoft.com/office/drawing/2010/main" xmlns:pic="http://schemas.openxmlformats.org/drawingml/2006/picture" xmlns:w="http://schemas.openxmlformats.org/wordprocessingml/2006/main" xmlns:w10="urn:schemas-microsoft-com:office:word" xmlns:v="urn:schemas-microsoft-com:vml" xmlns:o="urn:schemas-microsoft-com:office:office" xmlns:mv="urn:schemas-microsoft-com:mac:vml" xmlns:mo="http://schemas.microsoft.com/office/mac/office/2008/main" xmlns="" xmlns:arto="http://schemas.microsoft.com/office/word/2006/arto"/>
+                            <ma14:wrappingTextBoxFlag xmlns:arto="http://schemas.microsoft.com/office/word/2006/arto" xmlns="" xmlns:mo="http://schemas.microsoft.com/office/mac/office/2008/main" xmlns:mv="urn:schemas-microsoft-com:mac:vml" xmlns:o="urn:schemas-microsoft-com:office:office" xmlns:v="urn:schemas-microsoft-com:vml" xmlns:w10="urn:schemas-microsoft-com:office:word" xmlns:w="http://schemas.openxmlformats.org/wordprocessingml/2006/main" xmlns:pic="http://schemas.openxmlformats.org/drawingml/2006/picture" xmlns:a14="http://schemas.microsoft.com/office/drawing/2010/main" xmlns:ma14="http://schemas.microsoft.com/office/mac/drawingml/2011/main"/>
                           </a:ext>
                         </a:extLst>
                       </wps:spPr>
@@ -971,7 +971,7 @@
                         <a:effectLst/>
                         <a:extLst>
                           <a:ext uri="{C572A759-6A51-4108-AA02-DFA0A04FC94B}">
-                            <ma14:wrappingTextBoxFlag xmlns:ma14="http://schemas.microsoft.com/office/mac/drawingml/2011/main" xmlns:a14="http://schemas.microsoft.com/office/drawing/2010/main" xmlns:pic="http://schemas.openxmlformats.org/drawingml/2006/picture" xmlns:w="http://schemas.openxmlformats.org/wordprocessingml/2006/main" xmlns:w10="urn:schemas-microsoft-com:office:word" xmlns:v="urn:schemas-microsoft-com:vml" xmlns:o="urn:schemas-microsoft-com:office:office" xmlns:mv="urn:schemas-microsoft-com:mac:vml" xmlns:mo="http://schemas.microsoft.com/office/mac/office/2008/main" xmlns="" xmlns:arto="http://schemas.microsoft.com/office/word/2006/arto"/>
+                            <ma14:wrappingTextBoxFlag xmlns:arto="http://schemas.microsoft.com/office/word/2006/arto" xmlns="" xmlns:mo="http://schemas.microsoft.com/office/mac/office/2008/main" xmlns:mv="urn:schemas-microsoft-com:mac:vml" xmlns:o="urn:schemas-microsoft-com:office:office" xmlns:v="urn:schemas-microsoft-com:vml" xmlns:w10="urn:schemas-microsoft-com:office:word" xmlns:w="http://schemas.openxmlformats.org/wordprocessingml/2006/main" xmlns:pic="http://schemas.openxmlformats.org/drawingml/2006/picture" xmlns:a14="http://schemas.microsoft.com/office/drawing/2010/main" xmlns:ma14="http://schemas.microsoft.com/office/mac/drawingml/2011/main"/>
                           </a:ext>
                         </a:extLst>
                       </wps:spPr>
@@ -17399,6 +17399,3539 @@
       </w:tr>
       <w:tr>
         <w:trPr>
+          <w:trHeight w:val="791"/>
+        </w:trPr>
+        <w:tc>
+          <w:tcPr>
+            <w:tcW w:w="2582" w:type="dxa"/>
+            <w:tcBorders>
+              <w:bottom w:val="single" w:sz="4" w:space="0" w:color="auto"/>
+            </w:tcBorders>
+            <w:shd w:val="clear" w:color="auto" w:fill="000000" w:themeFill="text1"/>
+          </w:tcPr>
+          <w:p>
+            <w:pPr>
+              <w:rPr>
+                <w:rFonts w:asciiTheme="majorHAnsi" w:hAnsiTheme="majorHAnsi" w:cstheme="minorHAnsi"/>
+                <w:b/>
+                <w:bCs/>
+              </w:rPr>
+            </w:pPr>
+            <w:r>
+              <w:rPr>
+                <w:rFonts w:asciiTheme="majorHAnsi" w:hAnsiTheme="majorHAnsi" w:cstheme="minorHAnsi"/>
+                <w:b/>
+                <w:bCs/>
+              </w:rPr>
+              <w:lastRenderedPageBreak/>
+              <w:t>Clothing</w:t>
+            </w:r>
+            <w:r>
+              <w:rPr>
+                <w:rFonts w:asciiTheme="majorHAnsi" w:hAnsiTheme="majorHAnsi" w:cstheme="minorHAnsi"/>
+                <w:b/>
+                <w:bCs/>
+              </w:rPr>
+              <w:t xml:space="preserve"> </w:t>
+            </w:r>
+            <w:r>
+              <w:rPr>
+                <w:rFonts w:asciiTheme="majorHAnsi" w:hAnsiTheme="majorHAnsi" w:cstheme="minorHAnsi"/>
+                <w:b/>
+                <w:bCs/>
+              </w:rPr>
+              <w:t>&amp;</w:t>
+            </w:r>
+            <w:r>
+              <w:rPr>
+                <w:rFonts w:asciiTheme="majorHAnsi" w:hAnsiTheme="majorHAnsi" w:cstheme="minorHAnsi"/>
+                <w:b/>
+                <w:bCs/>
+              </w:rPr>
+              <w:t xml:space="preserve"> </w:t>
+            </w:r>
+            <w:r>
+              <w:rPr>
+                <w:rFonts w:asciiTheme="majorHAnsi" w:hAnsiTheme="majorHAnsi" w:cstheme="minorHAnsi"/>
+                <w:b/>
+                <w:bCs/>
+              </w:rPr>
+              <w:t>Armor</w:t>
+            </w:r>
+          </w:p>
+        </w:tc>
+        <w:tc>
+          <w:tcPr>
+            <w:tcW w:w="2509" w:type="dxa"/>
+            <w:tcBorders>
+              <w:bottom w:val="single" w:sz="4" w:space="0" w:color="auto"/>
+            </w:tcBorders>
+            <w:shd w:val="clear" w:color="auto" w:fill="000000" w:themeFill="text1"/>
+          </w:tcPr>
+          <w:p>
+            <w:pPr>
+              <w:rPr>
+                <w:rFonts w:asciiTheme="majorHAnsi" w:hAnsiTheme="majorHAnsi" w:cstheme="minorHAnsi"/>
+              </w:rPr>
+            </w:pPr>
+          </w:p>
+        </w:tc>
+        <w:tc>
+          <w:tcPr>
+            <w:tcW w:w="2261" w:type="dxa"/>
+            <w:shd w:val="clear" w:color="auto" w:fill="000000" w:themeFill="text1"/>
+          </w:tcPr>
+          <w:p>
+            <w:pPr>
+              <w:rPr>
+                <w:rFonts w:asciiTheme="majorHAnsi" w:hAnsiTheme="majorHAnsi" w:cstheme="minorHAnsi"/>
+              </w:rPr>
+            </w:pPr>
+          </w:p>
+        </w:tc>
+        <w:tc>
+          <w:tcPr>
+            <w:tcW w:w="2224" w:type="dxa"/>
+            <w:shd w:val="clear" w:color="auto" w:fill="000000" w:themeFill="text1"/>
+          </w:tcPr>
+          <w:p>
+            <w:pPr>
+              <w:rPr>
+                <w:rFonts w:asciiTheme="majorHAnsi" w:hAnsiTheme="majorHAnsi" w:cstheme="minorHAnsi"/>
+              </w:rPr>
+            </w:pPr>
+            <w:r>
+              <w:rPr>
+                <w:rFonts w:asciiTheme="majorHAnsi" w:hAnsiTheme="majorHAnsi" w:cstheme="minorHAnsi"/>
+              </w:rPr>
+              <w:t xml:space="preserve">See </w:t>
+            </w:r>
+            <w:proofErr w:type="spellStart"/>
+            <w:r>
+              <w:rPr>
+                <w:rFonts w:asciiTheme="majorHAnsi" w:hAnsiTheme="majorHAnsi" w:cstheme="minorHAnsi"/>
+              </w:rPr>
+              <w:t>Pureref’s</w:t>
+            </w:r>
+            <w:proofErr w:type="spellEnd"/>
+            <w:r>
+              <w:rPr>
+                <w:rFonts w:asciiTheme="majorHAnsi" w:hAnsiTheme="majorHAnsi" w:cstheme="minorHAnsi"/>
+              </w:rPr>
+              <w:t xml:space="preserve"> for Visual References. Starred Items*</w:t>
+            </w:r>
+          </w:p>
+        </w:tc>
+      </w:tr>
+      <w:tr>
+        <w:tc>
+          <w:tcPr>
+            <w:tcW w:w="2582" w:type="dxa"/>
+            <w:tcBorders>
+              <w:bottom w:val="single" w:sz="4" w:space="0" w:color="auto"/>
+            </w:tcBorders>
+            <w:shd w:val="clear" w:color="auto" w:fill="948A54" w:themeFill="background2" w:themeFillShade="80"/>
+          </w:tcPr>
+          <w:p>
+            <w:pPr>
+              <w:rPr>
+                <w:rFonts w:asciiTheme="majorHAnsi" w:hAnsiTheme="majorHAnsi" w:cstheme="minorHAnsi"/>
+                <w:b/>
+                <w:bCs/>
+              </w:rPr>
+            </w:pPr>
+            <w:r>
+              <w:rPr>
+                <w:rFonts w:asciiTheme="majorHAnsi" w:hAnsiTheme="majorHAnsi" w:cstheme="minorHAnsi"/>
+                <w:b/>
+                <w:bCs/>
+                <w:color w:val="FFFFFF" w:themeColor="background1"/>
+              </w:rPr>
+              <w:t>Bags</w:t>
+            </w:r>
+          </w:p>
+        </w:tc>
+        <w:tc>
+          <w:tcPr>
+            <w:tcW w:w="2509" w:type="dxa"/>
+            <w:tcBorders>
+              <w:bottom w:val="single" w:sz="4" w:space="0" w:color="auto"/>
+            </w:tcBorders>
+            <w:shd w:val="clear" w:color="auto" w:fill="948A54" w:themeFill="background2" w:themeFillShade="80"/>
+          </w:tcPr>
+          <w:p>
+            <w:pPr>
+              <w:rPr>
+                <w:rFonts w:asciiTheme="majorHAnsi" w:hAnsiTheme="majorHAnsi" w:cstheme="minorHAnsi"/>
+              </w:rPr>
+            </w:pPr>
+          </w:p>
+        </w:tc>
+        <w:tc>
+          <w:tcPr>
+            <w:tcW w:w="2261" w:type="dxa"/>
+            <w:shd w:val="clear" w:color="auto" w:fill="948A54" w:themeFill="background2" w:themeFillShade="80"/>
+          </w:tcPr>
+          <w:p>
+            <w:pPr>
+              <w:rPr>
+                <w:rFonts w:asciiTheme="majorHAnsi" w:hAnsiTheme="majorHAnsi" w:cstheme="minorHAnsi"/>
+              </w:rPr>
+            </w:pPr>
+          </w:p>
+        </w:tc>
+        <w:tc>
+          <w:tcPr>
+            <w:tcW w:w="2224" w:type="dxa"/>
+            <w:shd w:val="clear" w:color="auto" w:fill="948A54" w:themeFill="background2" w:themeFillShade="80"/>
+          </w:tcPr>
+          <w:p>
+            <w:pPr>
+              <w:rPr>
+                <w:rFonts w:asciiTheme="majorHAnsi" w:hAnsiTheme="majorHAnsi" w:cstheme="minorHAnsi"/>
+              </w:rPr>
+            </w:pPr>
+            <w:r>
+              <w:rPr>
+                <w:rFonts w:asciiTheme="majorHAnsi" w:hAnsiTheme="majorHAnsi" w:cstheme="minorHAnsi"/>
+              </w:rPr>
+              <w:t>Weight Rating # = When empty</w:t>
+            </w:r>
+          </w:p>
+        </w:tc>
+      </w:tr>
+      <w:tr>
+        <w:tc>
+          <w:tcPr>
+            <w:tcW w:w="2582" w:type="dxa"/>
+            <w:tcBorders>
+              <w:bottom w:val="single" w:sz="4" w:space="0" w:color="auto"/>
+            </w:tcBorders>
+            <w:shd w:val="clear" w:color="auto" w:fill="D9D9D9" w:themeFill="background1" w:themeFillShade="D9"/>
+          </w:tcPr>
+          <w:p>
+            <w:pPr>
+              <w:rPr>
+                <w:rFonts w:asciiTheme="majorHAnsi" w:hAnsiTheme="majorHAnsi" w:cstheme="minorHAnsi"/>
+                <w:b/>
+                <w:bCs/>
+              </w:rPr>
+            </w:pPr>
+            <w:r>
+              <w:rPr>
+                <w:rFonts w:asciiTheme="majorHAnsi" w:hAnsiTheme="majorHAnsi" w:cstheme="minorHAnsi"/>
+                <w:b/>
+                <w:bCs/>
+              </w:rPr>
+              <w:t>Bag</w:t>
+            </w:r>
+          </w:p>
+        </w:tc>
+        <w:tc>
+          <w:tcPr>
+            <w:tcW w:w="2509" w:type="dxa"/>
+            <w:tcBorders>
+              <w:bottom w:val="single" w:sz="4" w:space="0" w:color="auto"/>
+            </w:tcBorders>
+            <w:shd w:val="clear" w:color="auto" w:fill="D9D9D9" w:themeFill="background1" w:themeFillShade="D9"/>
+          </w:tcPr>
+          <w:p>
+            <w:pPr>
+              <w:rPr>
+                <w:rFonts w:asciiTheme="majorHAnsi" w:hAnsiTheme="majorHAnsi" w:cstheme="minorHAnsi"/>
+                <w:b/>
+                <w:bCs/>
+              </w:rPr>
+            </w:pPr>
+            <w:r>
+              <w:rPr>
+                <w:rFonts w:asciiTheme="majorHAnsi" w:hAnsiTheme="majorHAnsi" w:cstheme="minorHAnsi"/>
+                <w:b/>
+                <w:bCs/>
+              </w:rPr>
+              <w:t>Rarity</w:t>
+            </w:r>
+            <w:r>
+              <w:rPr>
+                <w:rFonts w:asciiTheme="majorHAnsi" w:hAnsiTheme="majorHAnsi" w:cstheme="minorHAnsi"/>
+                <w:b/>
+                <w:bCs/>
+              </w:rPr>
+              <w:t xml:space="preserve"> &amp; Tag</w:t>
+            </w:r>
+          </w:p>
+        </w:tc>
+        <w:tc>
+          <w:tcPr>
+            <w:tcW w:w="2261" w:type="dxa"/>
+            <w:shd w:val="clear" w:color="auto" w:fill="D9D9D9" w:themeFill="background1" w:themeFillShade="D9"/>
+          </w:tcPr>
+          <w:p>
+            <w:pPr>
+              <w:rPr>
+                <w:rFonts w:asciiTheme="majorHAnsi" w:hAnsiTheme="majorHAnsi" w:cstheme="minorHAnsi"/>
+                <w:b/>
+                <w:bCs/>
+              </w:rPr>
+            </w:pPr>
+            <w:r>
+              <w:rPr>
+                <w:rFonts w:asciiTheme="majorHAnsi" w:hAnsiTheme="majorHAnsi" w:cstheme="minorHAnsi"/>
+                <w:b/>
+                <w:bCs/>
+              </w:rPr>
+              <w:t>Details</w:t>
+            </w:r>
+          </w:p>
+        </w:tc>
+        <w:tc>
+          <w:tcPr>
+            <w:tcW w:w="2224" w:type="dxa"/>
+            <w:shd w:val="clear" w:color="auto" w:fill="D9D9D9" w:themeFill="background1" w:themeFillShade="D9"/>
+          </w:tcPr>
+          <w:p>
+            <w:pPr>
+              <w:rPr>
+                <w:rFonts w:asciiTheme="majorHAnsi" w:hAnsiTheme="majorHAnsi" w:cstheme="minorHAnsi"/>
+                <w:b/>
+                <w:bCs/>
+              </w:rPr>
+            </w:pPr>
+            <w:r>
+              <w:rPr>
+                <w:rFonts w:asciiTheme="majorHAnsi" w:hAnsiTheme="majorHAnsi" w:cstheme="minorHAnsi"/>
+                <w:b/>
+                <w:bCs/>
+              </w:rPr>
+              <w:t>Storage &amp; Weight</w:t>
+            </w:r>
+          </w:p>
+        </w:tc>
+      </w:tr>
+      <w:tr>
+        <w:tc>
+          <w:tcPr>
+            <w:tcW w:w="2582" w:type="dxa"/>
+            <w:tcBorders>
+              <w:bottom w:val="single" w:sz="4" w:space="0" w:color="auto"/>
+            </w:tcBorders>
+          </w:tcPr>
+          <w:p>
+            <w:pPr>
+              <w:rPr>
+                <w:rFonts w:asciiTheme="majorHAnsi" w:hAnsiTheme="majorHAnsi" w:cstheme="minorHAnsi"/>
+              </w:rPr>
+            </w:pPr>
+            <w:r>
+              <w:rPr>
+                <w:rFonts w:asciiTheme="majorHAnsi" w:hAnsiTheme="majorHAnsi" w:cstheme="minorHAnsi"/>
+              </w:rPr>
+              <w:t>Fanny Pack</w:t>
+            </w:r>
+          </w:p>
+        </w:tc>
+        <w:tc>
+          <w:tcPr>
+            <w:tcW w:w="2509" w:type="dxa"/>
+            <w:tcBorders>
+              <w:bottom w:val="single" w:sz="4" w:space="0" w:color="auto"/>
+            </w:tcBorders>
+          </w:tcPr>
+          <w:p>
+            <w:pPr>
+              <w:rPr>
+                <w:rFonts w:asciiTheme="majorHAnsi" w:hAnsiTheme="majorHAnsi" w:cstheme="minorHAnsi"/>
+              </w:rPr>
+            </w:pPr>
+            <w:r>
+              <w:rPr>
+                <w:rFonts w:asciiTheme="majorHAnsi" w:hAnsiTheme="majorHAnsi" w:cstheme="minorHAnsi"/>
+              </w:rPr>
+              <w:t>Common</w:t>
+            </w:r>
+          </w:p>
+          <w:p>
+            <w:pPr>
+              <w:rPr>
+                <w:rFonts w:asciiTheme="majorHAnsi" w:hAnsiTheme="majorHAnsi" w:cstheme="minorHAnsi"/>
+              </w:rPr>
+            </w:pPr>
+          </w:p>
+          <w:p>
+            <w:pPr>
+              <w:rPr>
+                <w:rFonts w:asciiTheme="majorHAnsi" w:hAnsiTheme="majorHAnsi" w:cstheme="minorHAnsi"/>
+              </w:rPr>
+            </w:pPr>
+            <w:r>
+              <w:rPr>
+                <w:rFonts w:asciiTheme="majorHAnsi" w:hAnsiTheme="majorHAnsi" w:cstheme="minorHAnsi"/>
+              </w:rPr>
+              <w:t>Small Bag</w:t>
+            </w:r>
+          </w:p>
+        </w:tc>
+        <w:tc>
+          <w:tcPr>
+            <w:tcW w:w="2261" w:type="dxa"/>
+          </w:tcPr>
+          <w:p>
+            <w:pPr>
+              <w:rPr>
+                <w:rFonts w:asciiTheme="majorHAnsi" w:hAnsiTheme="majorHAnsi" w:cstheme="minorHAnsi"/>
+              </w:rPr>
+            </w:pPr>
+            <w:r>
+              <w:rPr>
+                <w:rFonts w:asciiTheme="majorHAnsi" w:hAnsiTheme="majorHAnsi" w:cstheme="minorHAnsi"/>
+              </w:rPr>
+              <w:t xml:space="preserve">Goes across </w:t>
+            </w:r>
+            <w:proofErr w:type="gramStart"/>
+            <w:r>
+              <w:rPr>
+                <w:rFonts w:asciiTheme="majorHAnsi" w:hAnsiTheme="majorHAnsi" w:cstheme="minorHAnsi"/>
+              </w:rPr>
+              <w:t>player’s</w:t>
+            </w:r>
+            <w:proofErr w:type="gramEnd"/>
+            <w:r>
+              <w:rPr>
+                <w:rFonts w:asciiTheme="majorHAnsi" w:hAnsiTheme="majorHAnsi" w:cstheme="minorHAnsi"/>
+              </w:rPr>
+              <w:t xml:space="preserve"> chest or rests just above their hips in front or behind the player</w:t>
+            </w:r>
+          </w:p>
+          <w:p>
+            <w:pPr>
+              <w:rPr>
+                <w:rFonts w:asciiTheme="majorHAnsi" w:hAnsiTheme="majorHAnsi" w:cstheme="minorHAnsi"/>
+              </w:rPr>
+            </w:pPr>
+          </w:p>
+          <w:p>
+            <w:pPr>
+              <w:rPr>
+                <w:rFonts w:asciiTheme="majorHAnsi" w:hAnsiTheme="majorHAnsi" w:cstheme="minorHAnsi"/>
+              </w:rPr>
+            </w:pPr>
+            <w:r>
+              <w:rPr>
+                <w:rFonts w:asciiTheme="majorHAnsi" w:hAnsiTheme="majorHAnsi" w:cstheme="minorHAnsi"/>
+              </w:rPr>
+              <w:t>Doesn’t produce noise on walk cycle</w:t>
+            </w:r>
+          </w:p>
+        </w:tc>
+        <w:tc>
+          <w:tcPr>
+            <w:tcW w:w="2224" w:type="dxa"/>
+          </w:tcPr>
+          <w:p>
+            <w:pPr>
+              <w:rPr>
+                <w:rFonts w:asciiTheme="majorHAnsi" w:hAnsiTheme="majorHAnsi" w:cstheme="minorHAnsi"/>
+              </w:rPr>
+            </w:pPr>
+            <w:r>
+              <w:rPr>
+                <w:rFonts w:asciiTheme="majorHAnsi" w:hAnsiTheme="majorHAnsi" w:cstheme="minorHAnsi"/>
+              </w:rPr>
+              <w:t xml:space="preserve">Storage: </w:t>
+            </w:r>
+            <w:r>
+              <w:rPr>
+                <w:rFonts w:asciiTheme="majorHAnsi" w:hAnsiTheme="majorHAnsi" w:cstheme="minorHAnsi"/>
+                <w:b/>
+                <w:bCs/>
+              </w:rPr>
+              <w:t>Low</w:t>
+            </w:r>
+          </w:p>
+          <w:p>
+            <w:pPr>
+              <w:rPr>
+                <w:rFonts w:asciiTheme="majorHAnsi" w:hAnsiTheme="majorHAnsi" w:cstheme="minorHAnsi"/>
+              </w:rPr>
+            </w:pPr>
+          </w:p>
+          <w:p>
+            <w:pPr>
+              <w:rPr>
+                <w:rFonts w:asciiTheme="majorHAnsi" w:hAnsiTheme="majorHAnsi" w:cstheme="minorHAnsi"/>
+              </w:rPr>
+            </w:pPr>
+            <w:r>
+              <w:rPr>
+                <w:rFonts w:asciiTheme="majorHAnsi" w:hAnsiTheme="majorHAnsi" w:cstheme="minorHAnsi"/>
+              </w:rPr>
+              <w:t>Weight Rating: 1</w:t>
+            </w:r>
+          </w:p>
+        </w:tc>
+      </w:tr>
+      <w:tr>
+        <w:tc>
+          <w:tcPr>
+            <w:tcW w:w="2582" w:type="dxa"/>
+            <w:tcBorders>
+              <w:bottom w:val="single" w:sz="4" w:space="0" w:color="auto"/>
+            </w:tcBorders>
+          </w:tcPr>
+          <w:p>
+            <w:pPr>
+              <w:rPr>
+                <w:rFonts w:asciiTheme="majorHAnsi" w:hAnsiTheme="majorHAnsi" w:cstheme="minorHAnsi"/>
+              </w:rPr>
+            </w:pPr>
+            <w:r>
+              <w:rPr>
+                <w:rFonts w:asciiTheme="majorHAnsi" w:hAnsiTheme="majorHAnsi" w:cstheme="minorHAnsi"/>
+              </w:rPr>
+              <w:t xml:space="preserve">Satchel </w:t>
+            </w:r>
+          </w:p>
+        </w:tc>
+        <w:tc>
+          <w:tcPr>
+            <w:tcW w:w="2509" w:type="dxa"/>
+            <w:tcBorders>
+              <w:bottom w:val="single" w:sz="4" w:space="0" w:color="auto"/>
+            </w:tcBorders>
+          </w:tcPr>
+          <w:p>
+            <w:pPr>
+              <w:rPr>
+                <w:rFonts w:asciiTheme="majorHAnsi" w:hAnsiTheme="majorHAnsi" w:cstheme="minorHAnsi"/>
+              </w:rPr>
+            </w:pPr>
+            <w:r>
+              <w:rPr>
+                <w:rFonts w:asciiTheme="majorHAnsi" w:hAnsiTheme="majorHAnsi" w:cstheme="minorHAnsi"/>
+              </w:rPr>
+              <w:t>Uncommon</w:t>
+            </w:r>
+          </w:p>
+          <w:p>
+            <w:pPr>
+              <w:rPr>
+                <w:rFonts w:asciiTheme="majorHAnsi" w:hAnsiTheme="majorHAnsi" w:cstheme="minorHAnsi"/>
+              </w:rPr>
+            </w:pPr>
+          </w:p>
+          <w:p>
+            <w:pPr>
+              <w:rPr>
+                <w:rFonts w:asciiTheme="majorHAnsi" w:hAnsiTheme="majorHAnsi" w:cstheme="minorHAnsi"/>
+              </w:rPr>
+            </w:pPr>
+            <w:r>
+              <w:rPr>
+                <w:rFonts w:asciiTheme="majorHAnsi" w:hAnsiTheme="majorHAnsi" w:cstheme="minorHAnsi"/>
+              </w:rPr>
+              <w:t>Small Bag</w:t>
+            </w:r>
+          </w:p>
+        </w:tc>
+        <w:tc>
+          <w:tcPr>
+            <w:tcW w:w="2261" w:type="dxa"/>
+          </w:tcPr>
+          <w:p>
+            <w:pPr>
+              <w:rPr>
+                <w:rFonts w:asciiTheme="majorHAnsi" w:hAnsiTheme="majorHAnsi" w:cstheme="minorHAnsi"/>
+              </w:rPr>
+            </w:pPr>
+            <w:r>
+              <w:rPr>
+                <w:rFonts w:asciiTheme="majorHAnsi" w:hAnsiTheme="majorHAnsi" w:cstheme="minorHAnsi"/>
+              </w:rPr>
+              <w:t xml:space="preserve">Satchel with a sling that rests on </w:t>
+            </w:r>
+            <w:proofErr w:type="gramStart"/>
+            <w:r>
+              <w:rPr>
+                <w:rFonts w:asciiTheme="majorHAnsi" w:hAnsiTheme="majorHAnsi" w:cstheme="minorHAnsi"/>
+              </w:rPr>
+              <w:t>nears</w:t>
+            </w:r>
+            <w:proofErr w:type="gramEnd"/>
+            <w:r>
+              <w:rPr>
+                <w:rFonts w:asciiTheme="majorHAnsi" w:hAnsiTheme="majorHAnsi" w:cstheme="minorHAnsi"/>
+              </w:rPr>
+              <w:t xml:space="preserve"> the </w:t>
+            </w:r>
+            <w:proofErr w:type="gramStart"/>
+            <w:r>
+              <w:rPr>
+                <w:rFonts w:asciiTheme="majorHAnsi" w:hAnsiTheme="majorHAnsi" w:cstheme="minorHAnsi"/>
+              </w:rPr>
+              <w:t>players</w:t>
+            </w:r>
+            <w:proofErr w:type="gramEnd"/>
+            <w:r>
+              <w:rPr>
+                <w:rFonts w:asciiTheme="majorHAnsi" w:hAnsiTheme="majorHAnsi" w:cstheme="minorHAnsi"/>
+              </w:rPr>
+              <w:t xml:space="preserve"> hip with the strap going across their chest</w:t>
+            </w:r>
+          </w:p>
+          <w:p>
+            <w:pPr>
+              <w:rPr>
+                <w:rFonts w:asciiTheme="majorHAnsi" w:hAnsiTheme="majorHAnsi" w:cstheme="minorHAnsi"/>
+              </w:rPr>
+            </w:pPr>
+          </w:p>
+          <w:p>
+            <w:pPr>
+              <w:rPr>
+                <w:rFonts w:asciiTheme="majorHAnsi" w:hAnsiTheme="majorHAnsi" w:cstheme="minorHAnsi"/>
+              </w:rPr>
+            </w:pPr>
+            <w:r>
+              <w:rPr>
+                <w:rFonts w:asciiTheme="majorHAnsi" w:hAnsiTheme="majorHAnsi" w:cstheme="minorHAnsi"/>
+              </w:rPr>
+              <w:t>Quiet</w:t>
+            </w:r>
+          </w:p>
+        </w:tc>
+        <w:tc>
+          <w:tcPr>
+            <w:tcW w:w="2224" w:type="dxa"/>
+          </w:tcPr>
+          <w:p>
+            <w:pPr>
+              <w:rPr>
+                <w:rFonts w:asciiTheme="majorHAnsi" w:hAnsiTheme="majorHAnsi" w:cstheme="minorHAnsi"/>
+                <w:b/>
+                <w:bCs/>
+              </w:rPr>
+            </w:pPr>
+            <w:r>
+              <w:rPr>
+                <w:rFonts w:asciiTheme="majorHAnsi" w:hAnsiTheme="majorHAnsi" w:cstheme="minorHAnsi"/>
+              </w:rPr>
+              <w:t xml:space="preserve">Storage: </w:t>
+            </w:r>
+            <w:r>
+              <w:rPr>
+                <w:rFonts w:asciiTheme="majorHAnsi" w:hAnsiTheme="majorHAnsi" w:cstheme="minorHAnsi"/>
+                <w:b/>
+                <w:bCs/>
+              </w:rPr>
+              <w:t>Relatively Low</w:t>
+            </w:r>
+          </w:p>
+          <w:p>
+            <w:pPr>
+              <w:rPr>
+                <w:rFonts w:asciiTheme="majorHAnsi" w:hAnsiTheme="majorHAnsi" w:cstheme="minorHAnsi"/>
+                <w:b/>
+                <w:bCs/>
+              </w:rPr>
+            </w:pPr>
+          </w:p>
+          <w:p>
+            <w:pPr>
+              <w:rPr>
+                <w:rFonts w:asciiTheme="majorHAnsi" w:hAnsiTheme="majorHAnsi" w:cstheme="minorHAnsi"/>
+              </w:rPr>
+            </w:pPr>
+            <w:r>
+              <w:rPr>
+                <w:rFonts w:asciiTheme="majorHAnsi" w:hAnsiTheme="majorHAnsi" w:cstheme="minorHAnsi"/>
+              </w:rPr>
+              <w:t>Weight Rating: 1</w:t>
+            </w:r>
+          </w:p>
+        </w:tc>
+      </w:tr>
+      <w:tr>
+        <w:tc>
+          <w:tcPr>
+            <w:tcW w:w="2582" w:type="dxa"/>
+            <w:tcBorders>
+              <w:bottom w:val="single" w:sz="4" w:space="0" w:color="auto"/>
+            </w:tcBorders>
+          </w:tcPr>
+          <w:p>
+            <w:pPr>
+              <w:rPr>
+                <w:rFonts w:asciiTheme="majorHAnsi" w:hAnsiTheme="majorHAnsi" w:cstheme="minorHAnsi"/>
+              </w:rPr>
+            </w:pPr>
+            <w:r>
+              <w:rPr>
+                <w:rFonts w:asciiTheme="majorHAnsi" w:hAnsiTheme="majorHAnsi" w:cstheme="minorHAnsi"/>
+              </w:rPr>
+              <w:t>School Bag</w:t>
+            </w:r>
+          </w:p>
+        </w:tc>
+        <w:tc>
+          <w:tcPr>
+            <w:tcW w:w="2509" w:type="dxa"/>
+            <w:tcBorders>
+              <w:bottom w:val="single" w:sz="4" w:space="0" w:color="auto"/>
+            </w:tcBorders>
+          </w:tcPr>
+          <w:p>
+            <w:pPr>
+              <w:rPr>
+                <w:rFonts w:asciiTheme="majorHAnsi" w:hAnsiTheme="majorHAnsi" w:cstheme="minorHAnsi"/>
+              </w:rPr>
+            </w:pPr>
+            <w:r>
+              <w:rPr>
+                <w:rFonts w:asciiTheme="majorHAnsi" w:hAnsiTheme="majorHAnsi" w:cstheme="minorHAnsi"/>
+              </w:rPr>
+              <w:t>Common</w:t>
+            </w:r>
+          </w:p>
+          <w:p>
+            <w:pPr>
+              <w:rPr>
+                <w:rFonts w:asciiTheme="majorHAnsi" w:hAnsiTheme="majorHAnsi" w:cstheme="minorHAnsi"/>
+              </w:rPr>
+            </w:pPr>
+          </w:p>
+          <w:p>
+            <w:pPr>
+              <w:rPr>
+                <w:rFonts w:asciiTheme="majorHAnsi" w:hAnsiTheme="majorHAnsi" w:cstheme="minorHAnsi"/>
+              </w:rPr>
+            </w:pPr>
+            <w:r>
+              <w:rPr>
+                <w:rFonts w:asciiTheme="majorHAnsi" w:hAnsiTheme="majorHAnsi" w:cstheme="minorHAnsi"/>
+              </w:rPr>
+              <w:t>Medium Bag</w:t>
+            </w:r>
+          </w:p>
+        </w:tc>
+        <w:tc>
+          <w:tcPr>
+            <w:tcW w:w="2261" w:type="dxa"/>
+          </w:tcPr>
+          <w:p>
+            <w:pPr>
+              <w:rPr>
+                <w:rFonts w:asciiTheme="majorHAnsi" w:hAnsiTheme="majorHAnsi" w:cstheme="minorHAnsi"/>
+              </w:rPr>
+            </w:pPr>
+            <w:r>
+              <w:rPr>
+                <w:rFonts w:asciiTheme="majorHAnsi" w:hAnsiTheme="majorHAnsi" w:cstheme="minorHAnsi"/>
+              </w:rPr>
+              <w:t xml:space="preserve">School bag that comes in a variety of colors, Place on the </w:t>
+            </w:r>
+            <w:proofErr w:type="gramStart"/>
+            <w:r>
+              <w:rPr>
+                <w:rFonts w:asciiTheme="majorHAnsi" w:hAnsiTheme="majorHAnsi" w:cstheme="minorHAnsi"/>
+              </w:rPr>
+              <w:t>players</w:t>
+            </w:r>
+            <w:proofErr w:type="gramEnd"/>
+            <w:r>
+              <w:rPr>
+                <w:rFonts w:asciiTheme="majorHAnsi" w:hAnsiTheme="majorHAnsi" w:cstheme="minorHAnsi"/>
+              </w:rPr>
+              <w:t xml:space="preserve"> back.</w:t>
+            </w:r>
+          </w:p>
+          <w:p>
+            <w:pPr>
+              <w:rPr>
+                <w:rFonts w:asciiTheme="majorHAnsi" w:hAnsiTheme="majorHAnsi" w:cstheme="minorHAnsi"/>
+              </w:rPr>
+            </w:pPr>
+          </w:p>
+          <w:p>
+            <w:pPr>
+              <w:rPr>
+                <w:rFonts w:asciiTheme="majorHAnsi" w:hAnsiTheme="majorHAnsi" w:cstheme="minorHAnsi"/>
+              </w:rPr>
+            </w:pPr>
+            <w:r>
+              <w:rPr>
+                <w:rFonts w:asciiTheme="majorHAnsi" w:hAnsiTheme="majorHAnsi" w:cstheme="minorHAnsi"/>
+              </w:rPr>
+              <w:t>Produces little noise on walk cycle</w:t>
+            </w:r>
+          </w:p>
+        </w:tc>
+        <w:tc>
+          <w:tcPr>
+            <w:tcW w:w="2224" w:type="dxa"/>
+          </w:tcPr>
+          <w:p>
+            <w:pPr>
+              <w:rPr>
+                <w:rFonts w:asciiTheme="majorHAnsi" w:hAnsiTheme="majorHAnsi" w:cstheme="minorHAnsi"/>
+                <w:b/>
+                <w:bCs/>
+              </w:rPr>
+            </w:pPr>
+            <w:r>
+              <w:rPr>
+                <w:rFonts w:asciiTheme="majorHAnsi" w:hAnsiTheme="majorHAnsi" w:cstheme="minorHAnsi"/>
+              </w:rPr>
+              <w:t>Storage:</w:t>
+            </w:r>
+            <w:r>
+              <w:rPr>
+                <w:rFonts w:asciiTheme="majorHAnsi" w:hAnsiTheme="majorHAnsi" w:cstheme="minorHAnsi"/>
+                <w:b/>
+                <w:bCs/>
+              </w:rPr>
+              <w:t xml:space="preserve"> Medium</w:t>
+            </w:r>
+          </w:p>
+          <w:p>
+            <w:pPr>
+              <w:rPr>
+                <w:rFonts w:asciiTheme="majorHAnsi" w:hAnsiTheme="majorHAnsi" w:cstheme="minorHAnsi"/>
+                <w:b/>
+                <w:bCs/>
+              </w:rPr>
+            </w:pPr>
+          </w:p>
+          <w:p>
+            <w:pPr>
+              <w:rPr>
+                <w:rFonts w:asciiTheme="majorHAnsi" w:hAnsiTheme="majorHAnsi" w:cstheme="minorHAnsi"/>
+              </w:rPr>
+            </w:pPr>
+            <w:r>
+              <w:rPr>
+                <w:rFonts w:asciiTheme="majorHAnsi" w:hAnsiTheme="majorHAnsi" w:cstheme="minorHAnsi"/>
+              </w:rPr>
+              <w:t>Weight Rating: 2</w:t>
+            </w:r>
+          </w:p>
+        </w:tc>
+      </w:tr>
+      <w:tr>
+        <w:tc>
+          <w:tcPr>
+            <w:tcW w:w="2582" w:type="dxa"/>
+            <w:tcBorders>
+              <w:bottom w:val="single" w:sz="4" w:space="0" w:color="auto"/>
+            </w:tcBorders>
+          </w:tcPr>
+          <w:p>
+            <w:pPr>
+              <w:rPr>
+                <w:rFonts w:asciiTheme="majorHAnsi" w:hAnsiTheme="majorHAnsi" w:cstheme="minorHAnsi"/>
+              </w:rPr>
+            </w:pPr>
+            <w:r>
+              <w:rPr>
+                <w:rFonts w:asciiTheme="majorHAnsi" w:hAnsiTheme="majorHAnsi" w:cstheme="minorHAnsi"/>
+              </w:rPr>
+              <w:t>Duffle Bag</w:t>
+            </w:r>
+          </w:p>
+          <w:p>
+            <w:pPr>
+              <w:rPr>
+                <w:rFonts w:asciiTheme="majorHAnsi" w:hAnsiTheme="majorHAnsi" w:cstheme="minorHAnsi"/>
+              </w:rPr>
+            </w:pPr>
+          </w:p>
+          <w:p>
+            <w:pPr>
+              <w:rPr>
+                <w:rFonts w:asciiTheme="majorHAnsi" w:hAnsiTheme="majorHAnsi" w:cstheme="minorHAnsi"/>
+              </w:rPr>
+            </w:pPr>
+          </w:p>
+          <w:p>
+            <w:pPr>
+              <w:rPr>
+                <w:rFonts w:asciiTheme="majorHAnsi" w:hAnsiTheme="majorHAnsi" w:cstheme="minorHAnsi"/>
+              </w:rPr>
+            </w:pPr>
+          </w:p>
+          <w:p>
+            <w:pPr>
+              <w:rPr>
+                <w:rFonts w:asciiTheme="majorHAnsi" w:hAnsiTheme="majorHAnsi" w:cstheme="minorHAnsi"/>
+              </w:rPr>
+            </w:pPr>
+          </w:p>
+          <w:p>
+            <w:pPr>
+              <w:rPr>
+                <w:rFonts w:asciiTheme="majorHAnsi" w:hAnsiTheme="majorHAnsi" w:cstheme="minorHAnsi"/>
+              </w:rPr>
+            </w:pPr>
+          </w:p>
+          <w:p>
+            <w:pPr>
+              <w:rPr>
+                <w:rFonts w:asciiTheme="majorHAnsi" w:hAnsiTheme="majorHAnsi" w:cstheme="minorHAnsi"/>
+              </w:rPr>
+            </w:pPr>
+          </w:p>
+          <w:p>
+            <w:pPr>
+              <w:rPr>
+                <w:rFonts w:asciiTheme="majorHAnsi" w:hAnsiTheme="majorHAnsi" w:cstheme="minorHAnsi"/>
+              </w:rPr>
+            </w:pPr>
+          </w:p>
+          <w:p>
+            <w:pPr>
+              <w:rPr>
+                <w:rFonts w:asciiTheme="majorHAnsi" w:hAnsiTheme="majorHAnsi" w:cstheme="minorHAnsi"/>
+              </w:rPr>
+            </w:pPr>
+          </w:p>
+          <w:p>
+            <w:pPr>
+              <w:rPr>
+                <w:rFonts w:asciiTheme="majorHAnsi" w:hAnsiTheme="majorHAnsi" w:cstheme="minorHAnsi"/>
+              </w:rPr>
+            </w:pPr>
+          </w:p>
+          <w:p>
+            <w:pPr>
+              <w:rPr>
+                <w:rFonts w:asciiTheme="majorHAnsi" w:hAnsiTheme="majorHAnsi" w:cstheme="minorHAnsi"/>
+              </w:rPr>
+            </w:pPr>
+          </w:p>
+          <w:p>
+            <w:pPr>
+              <w:rPr>
+                <w:rFonts w:asciiTheme="majorHAnsi" w:hAnsiTheme="majorHAnsi" w:cstheme="minorHAnsi"/>
+              </w:rPr>
+            </w:pPr>
+          </w:p>
+          <w:p>
+            <w:pPr>
+              <w:rPr>
+                <w:rFonts w:asciiTheme="majorHAnsi" w:hAnsiTheme="majorHAnsi" w:cstheme="minorHAnsi"/>
+              </w:rPr>
+            </w:pPr>
+          </w:p>
+        </w:tc>
+        <w:tc>
+          <w:tcPr>
+            <w:tcW w:w="2509" w:type="dxa"/>
+            <w:tcBorders>
+              <w:bottom w:val="single" w:sz="4" w:space="0" w:color="auto"/>
+            </w:tcBorders>
+          </w:tcPr>
+          <w:p>
+            <w:pPr>
+              <w:rPr>
+                <w:rFonts w:asciiTheme="majorHAnsi" w:hAnsiTheme="majorHAnsi" w:cstheme="minorHAnsi"/>
+              </w:rPr>
+            </w:pPr>
+            <w:r>
+              <w:rPr>
+                <w:rFonts w:asciiTheme="majorHAnsi" w:hAnsiTheme="majorHAnsi" w:cstheme="minorHAnsi"/>
+              </w:rPr>
+              <w:lastRenderedPageBreak/>
+              <w:t>Uncommon</w:t>
+            </w:r>
+          </w:p>
+          <w:p>
+            <w:pPr>
+              <w:rPr>
+                <w:rFonts w:asciiTheme="majorHAnsi" w:hAnsiTheme="majorHAnsi" w:cstheme="minorHAnsi"/>
+              </w:rPr>
+            </w:pPr>
+          </w:p>
+          <w:p>
+            <w:pPr>
+              <w:rPr>
+                <w:rFonts w:asciiTheme="majorHAnsi" w:hAnsiTheme="majorHAnsi" w:cstheme="minorHAnsi"/>
+              </w:rPr>
+            </w:pPr>
+            <w:r>
+              <w:rPr>
+                <w:rFonts w:asciiTheme="majorHAnsi" w:hAnsiTheme="majorHAnsi" w:cstheme="minorHAnsi"/>
+              </w:rPr>
+              <w:t>Medium Bag</w:t>
+            </w:r>
+          </w:p>
+        </w:tc>
+        <w:tc>
+          <w:tcPr>
+            <w:tcW w:w="2261" w:type="dxa"/>
+          </w:tcPr>
+          <w:p>
+            <w:pPr>
+              <w:rPr>
+                <w:rFonts w:asciiTheme="majorHAnsi" w:hAnsiTheme="majorHAnsi" w:cstheme="minorHAnsi"/>
+              </w:rPr>
+            </w:pPr>
+            <w:r>
+              <w:rPr>
+                <w:rFonts w:asciiTheme="majorHAnsi" w:hAnsiTheme="majorHAnsi" w:cstheme="minorHAnsi"/>
+              </w:rPr>
+              <w:t xml:space="preserve">A bag typically used to hold sports equipment that can be worn near the hips with a strap across the chest, but </w:t>
+            </w:r>
+            <w:proofErr w:type="gramStart"/>
+            <w:r>
+              <w:rPr>
+                <w:rFonts w:asciiTheme="majorHAnsi" w:hAnsiTheme="majorHAnsi" w:cstheme="minorHAnsi"/>
+              </w:rPr>
+              <w:t>preferable</w:t>
+            </w:r>
+            <w:proofErr w:type="gramEnd"/>
+            <w:r>
+              <w:rPr>
+                <w:rFonts w:asciiTheme="majorHAnsi" w:hAnsiTheme="majorHAnsi" w:cstheme="minorHAnsi"/>
+              </w:rPr>
+              <w:t xml:space="preserve"> rests on the </w:t>
+            </w:r>
+            <w:proofErr w:type="gramStart"/>
+            <w:r>
+              <w:rPr>
+                <w:rFonts w:asciiTheme="majorHAnsi" w:hAnsiTheme="majorHAnsi" w:cstheme="minorHAnsi"/>
+              </w:rPr>
+              <w:t>players</w:t>
+            </w:r>
+            <w:proofErr w:type="gramEnd"/>
+            <w:r>
+              <w:rPr>
+                <w:rFonts w:asciiTheme="majorHAnsi" w:hAnsiTheme="majorHAnsi" w:cstheme="minorHAnsi"/>
+              </w:rPr>
+              <w:t xml:space="preserve"> back</w:t>
+            </w:r>
+          </w:p>
+          <w:p>
+            <w:pPr>
+              <w:rPr>
+                <w:rFonts w:asciiTheme="majorHAnsi" w:hAnsiTheme="majorHAnsi" w:cstheme="minorHAnsi"/>
+              </w:rPr>
+            </w:pPr>
+          </w:p>
+          <w:p>
+            <w:pPr>
+              <w:rPr>
+                <w:rFonts w:asciiTheme="majorHAnsi" w:hAnsiTheme="majorHAnsi" w:cstheme="minorHAnsi"/>
+              </w:rPr>
+            </w:pPr>
+            <w:r>
+              <w:rPr>
+                <w:rFonts w:asciiTheme="majorHAnsi" w:hAnsiTheme="majorHAnsi" w:cstheme="minorHAnsi"/>
+              </w:rPr>
+              <w:t>Produces noise on walk cycle</w:t>
+            </w:r>
+          </w:p>
+        </w:tc>
+        <w:tc>
+          <w:tcPr>
+            <w:tcW w:w="2224" w:type="dxa"/>
+          </w:tcPr>
+          <w:p>
+            <w:pPr>
+              <w:rPr>
+                <w:rFonts w:asciiTheme="majorHAnsi" w:hAnsiTheme="majorHAnsi" w:cstheme="minorHAnsi"/>
+              </w:rPr>
+            </w:pPr>
+            <w:r>
+              <w:rPr>
+                <w:rFonts w:asciiTheme="majorHAnsi" w:hAnsiTheme="majorHAnsi" w:cstheme="minorHAnsi"/>
+              </w:rPr>
+              <w:t xml:space="preserve">Storage: </w:t>
+            </w:r>
+            <w:r>
+              <w:rPr>
+                <w:rFonts w:asciiTheme="majorHAnsi" w:hAnsiTheme="majorHAnsi" w:cstheme="minorHAnsi"/>
+                <w:b/>
+                <w:bCs/>
+              </w:rPr>
+              <w:t>Medium</w:t>
+            </w:r>
+          </w:p>
+          <w:p>
+            <w:pPr>
+              <w:rPr>
+                <w:rFonts w:asciiTheme="majorHAnsi" w:hAnsiTheme="majorHAnsi" w:cstheme="minorHAnsi"/>
+              </w:rPr>
+            </w:pPr>
+          </w:p>
+          <w:p>
+            <w:pPr>
+              <w:rPr>
+                <w:rFonts w:asciiTheme="majorHAnsi" w:hAnsiTheme="majorHAnsi" w:cstheme="minorHAnsi"/>
+              </w:rPr>
+            </w:pPr>
+            <w:r>
+              <w:rPr>
+                <w:rFonts w:asciiTheme="majorHAnsi" w:hAnsiTheme="majorHAnsi" w:cstheme="minorHAnsi"/>
+              </w:rPr>
+              <w:t>Weight Rating: 2</w:t>
+            </w:r>
+          </w:p>
+        </w:tc>
+      </w:tr>
+      <w:tr>
+        <w:tc>
+          <w:tcPr>
+            <w:tcW w:w="2582" w:type="dxa"/>
+            <w:tcBorders>
+              <w:bottom w:val="single" w:sz="4" w:space="0" w:color="auto"/>
+            </w:tcBorders>
+          </w:tcPr>
+          <w:p>
+            <w:pPr>
+              <w:rPr>
+                <w:rFonts w:asciiTheme="majorHAnsi" w:hAnsiTheme="majorHAnsi" w:cstheme="minorHAnsi"/>
+              </w:rPr>
+            </w:pPr>
+            <w:r>
+              <w:rPr>
+                <w:rFonts w:asciiTheme="majorHAnsi" w:hAnsiTheme="majorHAnsi" w:cstheme="minorHAnsi"/>
+              </w:rPr>
+              <w:t>Leather/Wool Backpack</w:t>
+            </w:r>
+          </w:p>
+        </w:tc>
+        <w:tc>
+          <w:tcPr>
+            <w:tcW w:w="2509" w:type="dxa"/>
+            <w:tcBorders>
+              <w:bottom w:val="single" w:sz="4" w:space="0" w:color="auto"/>
+            </w:tcBorders>
+          </w:tcPr>
+          <w:p>
+            <w:pPr>
+              <w:rPr>
+                <w:rFonts w:asciiTheme="majorHAnsi" w:hAnsiTheme="majorHAnsi" w:cstheme="minorHAnsi"/>
+              </w:rPr>
+            </w:pPr>
+            <w:r>
+              <w:rPr>
+                <w:rFonts w:asciiTheme="majorHAnsi" w:hAnsiTheme="majorHAnsi" w:cstheme="minorHAnsi"/>
+              </w:rPr>
+              <w:t>Rare</w:t>
+            </w:r>
+          </w:p>
+          <w:p>
+            <w:pPr>
+              <w:rPr>
+                <w:rFonts w:asciiTheme="majorHAnsi" w:hAnsiTheme="majorHAnsi" w:cstheme="minorHAnsi"/>
+              </w:rPr>
+            </w:pPr>
+          </w:p>
+          <w:p>
+            <w:pPr>
+              <w:rPr>
+                <w:rFonts w:asciiTheme="majorHAnsi" w:hAnsiTheme="majorHAnsi" w:cstheme="minorHAnsi"/>
+              </w:rPr>
+            </w:pPr>
+            <w:r>
+              <w:rPr>
+                <w:rFonts w:asciiTheme="majorHAnsi" w:hAnsiTheme="majorHAnsi" w:cstheme="minorHAnsi"/>
+              </w:rPr>
+              <w:t>Medium Bag</w:t>
+            </w:r>
+          </w:p>
+        </w:tc>
+        <w:tc>
+          <w:tcPr>
+            <w:tcW w:w="2261" w:type="dxa"/>
+          </w:tcPr>
+          <w:p>
+            <w:pPr>
+              <w:rPr>
+                <w:rFonts w:asciiTheme="majorHAnsi" w:hAnsiTheme="majorHAnsi" w:cstheme="minorHAnsi"/>
+              </w:rPr>
+            </w:pPr>
+            <w:r>
+              <w:rPr>
+                <w:rFonts w:asciiTheme="majorHAnsi" w:hAnsiTheme="majorHAnsi" w:cstheme="minorHAnsi"/>
+              </w:rPr>
+              <w:t xml:space="preserve">A backpack with leather straps and waterproof/wooly fabric. Can also be </w:t>
+            </w:r>
+            <w:proofErr w:type="gramStart"/>
+            <w:r>
+              <w:rPr>
+                <w:rFonts w:asciiTheme="majorHAnsi" w:hAnsiTheme="majorHAnsi" w:cstheme="minorHAnsi"/>
+              </w:rPr>
+              <w:t>made out of</w:t>
+            </w:r>
+            <w:proofErr w:type="gramEnd"/>
+            <w:r>
+              <w:rPr>
+                <w:rFonts w:asciiTheme="majorHAnsi" w:hAnsiTheme="majorHAnsi" w:cstheme="minorHAnsi"/>
+              </w:rPr>
+              <w:t xml:space="preserve"> leather.</w:t>
+            </w:r>
+          </w:p>
+          <w:p>
+            <w:pPr>
+              <w:rPr>
+                <w:rFonts w:asciiTheme="majorHAnsi" w:hAnsiTheme="majorHAnsi" w:cstheme="minorHAnsi"/>
+              </w:rPr>
+            </w:pPr>
+          </w:p>
+          <w:p>
+            <w:pPr>
+              <w:rPr>
+                <w:rFonts w:asciiTheme="majorHAnsi" w:hAnsiTheme="majorHAnsi" w:cstheme="minorHAnsi"/>
+              </w:rPr>
+            </w:pPr>
+            <w:r>
+              <w:rPr>
+                <w:rFonts w:asciiTheme="majorHAnsi" w:hAnsiTheme="majorHAnsi" w:cstheme="minorHAnsi"/>
+              </w:rPr>
+              <w:t>Largest of the Medium bags</w:t>
+            </w:r>
+          </w:p>
+          <w:p>
+            <w:pPr>
+              <w:rPr>
+                <w:rFonts w:asciiTheme="majorHAnsi" w:hAnsiTheme="majorHAnsi" w:cstheme="minorHAnsi"/>
+              </w:rPr>
+            </w:pPr>
+          </w:p>
+          <w:p>
+            <w:pPr>
+              <w:rPr>
+                <w:rFonts w:asciiTheme="majorHAnsi" w:hAnsiTheme="majorHAnsi" w:cstheme="minorHAnsi"/>
+              </w:rPr>
+            </w:pPr>
+            <w:r>
+              <w:rPr>
+                <w:rFonts w:asciiTheme="majorHAnsi" w:hAnsiTheme="majorHAnsi" w:cstheme="minorHAnsi"/>
+              </w:rPr>
+              <w:t>Produces noise in walk cycle</w:t>
+            </w:r>
+          </w:p>
+        </w:tc>
+        <w:tc>
+          <w:tcPr>
+            <w:tcW w:w="2224" w:type="dxa"/>
+          </w:tcPr>
+          <w:p>
+            <w:pPr>
+              <w:rPr>
+                <w:rFonts w:asciiTheme="majorHAnsi" w:hAnsiTheme="majorHAnsi" w:cstheme="minorHAnsi"/>
+                <w:b/>
+                <w:bCs/>
+              </w:rPr>
+            </w:pPr>
+            <w:r>
+              <w:rPr>
+                <w:rFonts w:asciiTheme="majorHAnsi" w:hAnsiTheme="majorHAnsi" w:cstheme="minorHAnsi"/>
+              </w:rPr>
+              <w:t xml:space="preserve">Storage: </w:t>
+            </w:r>
+            <w:r>
+              <w:rPr>
+                <w:rFonts w:asciiTheme="majorHAnsi" w:hAnsiTheme="majorHAnsi" w:cstheme="minorHAnsi"/>
+                <w:b/>
+                <w:bCs/>
+              </w:rPr>
+              <w:t>Medium</w:t>
+            </w:r>
+          </w:p>
+          <w:p>
+            <w:pPr>
+              <w:rPr>
+                <w:rFonts w:asciiTheme="majorHAnsi" w:hAnsiTheme="majorHAnsi" w:cstheme="minorHAnsi"/>
+                <w:b/>
+                <w:bCs/>
+              </w:rPr>
+            </w:pPr>
+          </w:p>
+          <w:p>
+            <w:pPr>
+              <w:rPr>
+                <w:rFonts w:asciiTheme="majorHAnsi" w:hAnsiTheme="majorHAnsi" w:cstheme="minorHAnsi"/>
+              </w:rPr>
+            </w:pPr>
+            <w:r>
+              <w:rPr>
+                <w:rFonts w:asciiTheme="majorHAnsi" w:hAnsiTheme="majorHAnsi" w:cstheme="minorHAnsi"/>
+              </w:rPr>
+              <w:t>Weight Rating:</w:t>
+            </w:r>
+            <w:r>
+              <w:rPr>
+                <w:rFonts w:asciiTheme="majorHAnsi" w:hAnsiTheme="majorHAnsi" w:cstheme="minorHAnsi"/>
+              </w:rPr>
+              <w:t xml:space="preserve"> 2</w:t>
+            </w:r>
+          </w:p>
+        </w:tc>
+      </w:tr>
+      <w:tr>
+        <w:tc>
+          <w:tcPr>
+            <w:tcW w:w="2582" w:type="dxa"/>
+            <w:tcBorders>
+              <w:bottom w:val="single" w:sz="4" w:space="0" w:color="auto"/>
+            </w:tcBorders>
+          </w:tcPr>
+          <w:p>
+            <w:pPr>
+              <w:rPr>
+                <w:rFonts w:asciiTheme="majorHAnsi" w:hAnsiTheme="majorHAnsi" w:cstheme="minorHAnsi"/>
+              </w:rPr>
+            </w:pPr>
+            <w:r>
+              <w:rPr>
+                <w:rFonts w:asciiTheme="majorHAnsi" w:hAnsiTheme="majorHAnsi" w:cstheme="minorHAnsi"/>
+              </w:rPr>
+              <w:t>Hiker</w:t>
+            </w:r>
+            <w:r>
+              <w:rPr>
+                <w:rFonts w:asciiTheme="majorHAnsi" w:hAnsiTheme="majorHAnsi" w:cstheme="minorHAnsi"/>
+              </w:rPr>
+              <w:t>’s/Climber’s</w:t>
+            </w:r>
+            <w:r>
+              <w:rPr>
+                <w:rFonts w:asciiTheme="majorHAnsi" w:hAnsiTheme="majorHAnsi" w:cstheme="minorHAnsi"/>
+              </w:rPr>
+              <w:t xml:space="preserve"> Backpack</w:t>
+            </w:r>
+          </w:p>
+        </w:tc>
+        <w:tc>
+          <w:tcPr>
+            <w:tcW w:w="2509" w:type="dxa"/>
+            <w:tcBorders>
+              <w:bottom w:val="single" w:sz="4" w:space="0" w:color="auto"/>
+            </w:tcBorders>
+          </w:tcPr>
+          <w:p>
+            <w:pPr>
+              <w:rPr>
+                <w:rFonts w:asciiTheme="majorHAnsi" w:hAnsiTheme="majorHAnsi" w:cstheme="minorHAnsi"/>
+              </w:rPr>
+            </w:pPr>
+            <w:r>
+              <w:rPr>
+                <w:rFonts w:asciiTheme="majorHAnsi" w:hAnsiTheme="majorHAnsi" w:cstheme="minorHAnsi"/>
+              </w:rPr>
+              <w:t>Very Rare</w:t>
+            </w:r>
+          </w:p>
+        </w:tc>
+        <w:tc>
+          <w:tcPr>
+            <w:tcW w:w="2261" w:type="dxa"/>
+          </w:tcPr>
+          <w:p>
+            <w:pPr>
+              <w:rPr>
+                <w:rFonts w:asciiTheme="majorHAnsi" w:hAnsiTheme="majorHAnsi" w:cstheme="minorHAnsi"/>
+              </w:rPr>
+            </w:pPr>
+            <w:r>
+              <w:rPr>
+                <w:rFonts w:asciiTheme="majorHAnsi" w:hAnsiTheme="majorHAnsi" w:cstheme="minorHAnsi"/>
+              </w:rPr>
+              <w:t xml:space="preserve">Vertically Large backpack meant to hold long rope, and an assortment of items meant for the outdoors. Made from </w:t>
+            </w:r>
+            <w:proofErr w:type="gramStart"/>
+            <w:r>
+              <w:rPr>
+                <w:rFonts w:asciiTheme="majorHAnsi" w:hAnsiTheme="majorHAnsi" w:cstheme="minorHAnsi"/>
+              </w:rPr>
+              <w:t>water proof</w:t>
+            </w:r>
+            <w:proofErr w:type="gramEnd"/>
+            <w:r>
+              <w:rPr>
+                <w:rFonts w:asciiTheme="majorHAnsi" w:hAnsiTheme="majorHAnsi" w:cstheme="minorHAnsi"/>
+              </w:rPr>
+              <w:t xml:space="preserve"> material like nylon</w:t>
+            </w:r>
+          </w:p>
+          <w:p>
+            <w:pPr>
+              <w:rPr>
+                <w:rFonts w:asciiTheme="majorHAnsi" w:hAnsiTheme="majorHAnsi" w:cstheme="minorHAnsi"/>
+              </w:rPr>
+            </w:pPr>
+          </w:p>
+          <w:p>
+            <w:pPr>
+              <w:rPr>
+                <w:rFonts w:asciiTheme="majorHAnsi" w:hAnsiTheme="majorHAnsi" w:cstheme="minorHAnsi"/>
+              </w:rPr>
+            </w:pPr>
+            <w:r>
+              <w:rPr>
+                <w:rFonts w:asciiTheme="majorHAnsi" w:hAnsiTheme="majorHAnsi" w:cstheme="minorHAnsi"/>
+              </w:rPr>
+              <w:t>Produces a lot of sound, especially when full</w:t>
+            </w:r>
+          </w:p>
+        </w:tc>
+        <w:tc>
+          <w:tcPr>
+            <w:tcW w:w="2224" w:type="dxa"/>
+          </w:tcPr>
+          <w:p>
+            <w:pPr>
+              <w:rPr>
+                <w:rFonts w:asciiTheme="majorHAnsi" w:hAnsiTheme="majorHAnsi" w:cstheme="minorHAnsi"/>
+              </w:rPr>
+            </w:pPr>
+            <w:r>
+              <w:rPr>
+                <w:rFonts w:asciiTheme="majorHAnsi" w:hAnsiTheme="majorHAnsi" w:cstheme="minorHAnsi"/>
+              </w:rPr>
+              <w:t>Storage: Large</w:t>
+            </w:r>
+          </w:p>
+          <w:p>
+            <w:pPr>
+              <w:rPr>
+                <w:rFonts w:asciiTheme="majorHAnsi" w:hAnsiTheme="majorHAnsi" w:cstheme="minorHAnsi"/>
+              </w:rPr>
+            </w:pPr>
+          </w:p>
+          <w:p>
+            <w:pPr>
+              <w:rPr>
+                <w:rFonts w:asciiTheme="majorHAnsi" w:hAnsiTheme="majorHAnsi" w:cstheme="minorHAnsi"/>
+              </w:rPr>
+            </w:pPr>
+            <w:r>
+              <w:rPr>
+                <w:rFonts w:asciiTheme="majorHAnsi" w:hAnsiTheme="majorHAnsi" w:cstheme="minorHAnsi"/>
+              </w:rPr>
+              <w:t>Weight Rating: 3</w:t>
+            </w:r>
+          </w:p>
+        </w:tc>
+      </w:tr>
+      <w:tr>
+        <w:tc>
+          <w:tcPr>
+            <w:tcW w:w="2582" w:type="dxa"/>
+            <w:tcBorders>
+              <w:bottom w:val="single" w:sz="4" w:space="0" w:color="auto"/>
+            </w:tcBorders>
+          </w:tcPr>
+          <w:p>
+            <w:pPr>
+              <w:rPr>
+                <w:rFonts w:asciiTheme="majorHAnsi" w:hAnsiTheme="majorHAnsi" w:cstheme="minorHAnsi"/>
+              </w:rPr>
+            </w:pPr>
+            <w:proofErr w:type="spellStart"/>
+            <w:r>
+              <w:rPr>
+                <w:rFonts w:asciiTheme="majorHAnsi" w:hAnsiTheme="majorHAnsi" w:cstheme="minorHAnsi"/>
+              </w:rPr>
+              <w:t>Alicepack</w:t>
+            </w:r>
+            <w:proofErr w:type="spellEnd"/>
+          </w:p>
+        </w:tc>
+        <w:tc>
+          <w:tcPr>
+            <w:tcW w:w="2509" w:type="dxa"/>
+            <w:tcBorders>
+              <w:bottom w:val="single" w:sz="4" w:space="0" w:color="auto"/>
+            </w:tcBorders>
+          </w:tcPr>
+          <w:p>
+            <w:pPr>
+              <w:rPr>
+                <w:rFonts w:asciiTheme="majorHAnsi" w:hAnsiTheme="majorHAnsi" w:cstheme="minorHAnsi"/>
+              </w:rPr>
+            </w:pPr>
+            <w:r>
+              <w:rPr>
+                <w:rFonts w:asciiTheme="majorHAnsi" w:hAnsiTheme="majorHAnsi" w:cstheme="minorHAnsi"/>
+              </w:rPr>
+              <w:t>Extremely Rare</w:t>
+            </w:r>
+          </w:p>
+        </w:tc>
+        <w:tc>
+          <w:tcPr>
+            <w:tcW w:w="2261" w:type="dxa"/>
+          </w:tcPr>
+          <w:p>
+            <w:pPr>
+              <w:rPr>
+                <w:rFonts w:asciiTheme="majorHAnsi" w:hAnsiTheme="majorHAnsi" w:cstheme="minorHAnsi"/>
+              </w:rPr>
+            </w:pPr>
+            <w:r>
+              <w:rPr>
+                <w:rFonts w:asciiTheme="majorHAnsi" w:hAnsiTheme="majorHAnsi" w:cstheme="minorHAnsi"/>
+              </w:rPr>
+              <w:t xml:space="preserve">Large backpack used by the </w:t>
+            </w:r>
+            <w:r>
+              <w:rPr>
+                <w:rFonts w:asciiTheme="majorHAnsi" w:hAnsiTheme="majorHAnsi" w:cstheme="minorHAnsi"/>
+              </w:rPr>
+              <w:t>military</w:t>
+            </w:r>
+            <w:r>
+              <w:rPr>
+                <w:rFonts w:asciiTheme="majorHAnsi" w:hAnsiTheme="majorHAnsi" w:cstheme="minorHAnsi"/>
+              </w:rPr>
+              <w:t xml:space="preserve"> features many pouches on its exteriors</w:t>
+            </w:r>
+            <w:r>
+              <w:rPr>
+                <w:rFonts w:asciiTheme="majorHAnsi" w:hAnsiTheme="majorHAnsi" w:cstheme="minorHAnsi"/>
+              </w:rPr>
+              <w:t xml:space="preserve"> and clips</w:t>
+            </w:r>
+          </w:p>
+          <w:p>
+            <w:pPr>
+              <w:rPr>
+                <w:rFonts w:asciiTheme="majorHAnsi" w:hAnsiTheme="majorHAnsi" w:cstheme="minorHAnsi"/>
+              </w:rPr>
+            </w:pPr>
+          </w:p>
+          <w:p>
+            <w:pPr>
+              <w:rPr>
+                <w:rFonts w:asciiTheme="majorHAnsi" w:hAnsiTheme="majorHAnsi" w:cstheme="minorHAnsi"/>
+              </w:rPr>
+            </w:pPr>
+            <w:r>
+              <w:rPr>
+                <w:rFonts w:asciiTheme="majorHAnsi" w:hAnsiTheme="majorHAnsi" w:cstheme="minorHAnsi"/>
+              </w:rPr>
+              <w:t>Produces a lot of sound, especially when full</w:t>
+            </w:r>
+          </w:p>
+        </w:tc>
+        <w:tc>
+          <w:tcPr>
+            <w:tcW w:w="2224" w:type="dxa"/>
+          </w:tcPr>
+          <w:p>
+            <w:pPr>
+              <w:rPr>
+                <w:rFonts w:asciiTheme="majorHAnsi" w:hAnsiTheme="majorHAnsi" w:cstheme="minorHAnsi"/>
+              </w:rPr>
+            </w:pPr>
+            <w:r>
+              <w:rPr>
+                <w:rFonts w:asciiTheme="majorHAnsi" w:hAnsiTheme="majorHAnsi" w:cstheme="minorHAnsi"/>
+              </w:rPr>
+              <w:t>Storage Large</w:t>
+            </w:r>
+          </w:p>
+          <w:p>
+            <w:pPr>
+              <w:rPr>
+                <w:rFonts w:asciiTheme="majorHAnsi" w:hAnsiTheme="majorHAnsi" w:cstheme="minorHAnsi"/>
+              </w:rPr>
+            </w:pPr>
+          </w:p>
+          <w:p>
+            <w:pPr>
+              <w:rPr>
+                <w:rFonts w:asciiTheme="majorHAnsi" w:hAnsiTheme="majorHAnsi" w:cstheme="minorHAnsi"/>
+              </w:rPr>
+            </w:pPr>
+            <w:r>
+              <w:rPr>
+                <w:rFonts w:asciiTheme="majorHAnsi" w:hAnsiTheme="majorHAnsi" w:cstheme="minorHAnsi"/>
+              </w:rPr>
+              <w:t>Weight Rating: 3</w:t>
+            </w:r>
+          </w:p>
+        </w:tc>
+      </w:tr>
+      <w:tr>
+        <w:tc>
+          <w:tcPr>
+            <w:tcW w:w="2582" w:type="dxa"/>
+            <w:tcBorders>
+              <w:bottom w:val="single" w:sz="4" w:space="0" w:color="auto"/>
+            </w:tcBorders>
+          </w:tcPr>
+          <w:p>
+            <w:pPr>
+              <w:rPr>
+                <w:rFonts w:asciiTheme="majorHAnsi" w:hAnsiTheme="majorHAnsi" w:cstheme="minorHAnsi"/>
+              </w:rPr>
+            </w:pPr>
+            <w:r>
+              <w:rPr>
+                <w:rFonts w:asciiTheme="majorHAnsi" w:hAnsiTheme="majorHAnsi" w:cstheme="minorHAnsi"/>
+              </w:rPr>
+              <w:t>Survivalist Backpack</w:t>
+            </w:r>
+          </w:p>
+          <w:p>
+            <w:pPr>
+              <w:rPr>
+                <w:rFonts w:asciiTheme="majorHAnsi" w:hAnsiTheme="majorHAnsi" w:cstheme="minorHAnsi"/>
+              </w:rPr>
+            </w:pPr>
+          </w:p>
+          <w:p>
+            <w:pPr>
+              <w:rPr>
+                <w:rFonts w:asciiTheme="majorHAnsi" w:hAnsiTheme="majorHAnsi" w:cstheme="minorHAnsi"/>
+              </w:rPr>
+            </w:pPr>
+          </w:p>
+          <w:p>
+            <w:pPr>
+              <w:rPr>
+                <w:rFonts w:asciiTheme="majorHAnsi" w:hAnsiTheme="majorHAnsi" w:cstheme="minorHAnsi"/>
+              </w:rPr>
+            </w:pPr>
+          </w:p>
+          <w:p>
+            <w:pPr>
+              <w:rPr>
+                <w:rFonts w:asciiTheme="majorHAnsi" w:hAnsiTheme="majorHAnsi" w:cstheme="minorHAnsi"/>
+              </w:rPr>
+            </w:pPr>
+          </w:p>
+          <w:p>
+            <w:pPr>
+              <w:rPr>
+                <w:rFonts w:asciiTheme="majorHAnsi" w:hAnsiTheme="majorHAnsi" w:cstheme="minorHAnsi"/>
+              </w:rPr>
+            </w:pPr>
+          </w:p>
+          <w:p>
+            <w:pPr>
+              <w:rPr>
+                <w:rFonts w:asciiTheme="majorHAnsi" w:hAnsiTheme="majorHAnsi" w:cstheme="minorHAnsi"/>
+              </w:rPr>
+            </w:pPr>
+          </w:p>
+          <w:p>
+            <w:pPr>
+              <w:rPr>
+                <w:rFonts w:asciiTheme="majorHAnsi" w:hAnsiTheme="majorHAnsi" w:cstheme="minorHAnsi"/>
+              </w:rPr>
+            </w:pPr>
+          </w:p>
+          <w:p>
+            <w:pPr>
+              <w:rPr>
+                <w:rFonts w:asciiTheme="majorHAnsi" w:hAnsiTheme="majorHAnsi" w:cstheme="minorHAnsi"/>
+              </w:rPr>
+            </w:pPr>
+          </w:p>
+        </w:tc>
+        <w:tc>
+          <w:tcPr>
+            <w:tcW w:w="2509" w:type="dxa"/>
+            <w:tcBorders>
+              <w:bottom w:val="single" w:sz="4" w:space="0" w:color="auto"/>
+            </w:tcBorders>
+          </w:tcPr>
+          <w:p>
+            <w:pPr>
+              <w:rPr>
+                <w:rFonts w:asciiTheme="majorHAnsi" w:hAnsiTheme="majorHAnsi" w:cstheme="minorHAnsi"/>
+              </w:rPr>
+            </w:pPr>
+            <w:r>
+              <w:rPr>
+                <w:rFonts w:asciiTheme="majorHAnsi" w:hAnsiTheme="majorHAnsi" w:cstheme="minorHAnsi"/>
+              </w:rPr>
+              <w:t>Very Rare</w:t>
+            </w:r>
+          </w:p>
+        </w:tc>
+        <w:tc>
+          <w:tcPr>
+            <w:tcW w:w="2261" w:type="dxa"/>
+          </w:tcPr>
+          <w:p>
+            <w:pPr>
+              <w:rPr>
+                <w:rFonts w:asciiTheme="majorHAnsi" w:hAnsiTheme="majorHAnsi" w:cstheme="minorHAnsi"/>
+              </w:rPr>
+            </w:pPr>
+            <w:proofErr w:type="spellStart"/>
+            <w:r>
+              <w:rPr>
+                <w:rFonts w:asciiTheme="majorHAnsi" w:hAnsiTheme="majorHAnsi" w:cstheme="minorHAnsi"/>
+              </w:rPr>
+              <w:t>Leatherbag</w:t>
+            </w:r>
+            <w:proofErr w:type="spellEnd"/>
+            <w:r>
+              <w:rPr>
+                <w:rFonts w:asciiTheme="majorHAnsi" w:hAnsiTheme="majorHAnsi" w:cstheme="minorHAnsi"/>
+              </w:rPr>
+              <w:t xml:space="preserve"> meant for large stretches of time out in the wilderness</w:t>
+            </w:r>
+          </w:p>
+          <w:p>
+            <w:pPr>
+              <w:rPr>
+                <w:rFonts w:asciiTheme="majorHAnsi" w:hAnsiTheme="majorHAnsi" w:cstheme="minorHAnsi"/>
+              </w:rPr>
+            </w:pPr>
+          </w:p>
+          <w:p>
+            <w:pPr>
+              <w:rPr>
+                <w:rFonts w:asciiTheme="majorHAnsi" w:hAnsiTheme="majorHAnsi" w:cstheme="minorHAnsi"/>
+              </w:rPr>
+            </w:pPr>
+            <w:r>
+              <w:rPr>
+                <w:rFonts w:asciiTheme="majorHAnsi" w:hAnsiTheme="majorHAnsi" w:cstheme="minorHAnsi"/>
+              </w:rPr>
+              <w:t>Produces a lot of sound, especially when full</w:t>
+            </w:r>
+          </w:p>
+        </w:tc>
+        <w:tc>
+          <w:tcPr>
+            <w:tcW w:w="2224" w:type="dxa"/>
+          </w:tcPr>
+          <w:p>
+            <w:pPr>
+              <w:rPr>
+                <w:rFonts w:asciiTheme="majorHAnsi" w:hAnsiTheme="majorHAnsi" w:cstheme="minorHAnsi"/>
+              </w:rPr>
+            </w:pPr>
+            <w:r>
+              <w:rPr>
+                <w:rFonts w:asciiTheme="majorHAnsi" w:hAnsiTheme="majorHAnsi" w:cstheme="minorHAnsi"/>
+              </w:rPr>
+              <w:t>Storage Large</w:t>
+            </w:r>
+          </w:p>
+          <w:p>
+            <w:pPr>
+              <w:rPr>
+                <w:rFonts w:asciiTheme="majorHAnsi" w:hAnsiTheme="majorHAnsi" w:cstheme="minorHAnsi"/>
+              </w:rPr>
+            </w:pPr>
+          </w:p>
+          <w:p>
+            <w:pPr>
+              <w:rPr>
+                <w:rFonts w:asciiTheme="majorHAnsi" w:hAnsiTheme="majorHAnsi" w:cstheme="minorHAnsi"/>
+              </w:rPr>
+            </w:pPr>
+            <w:r>
+              <w:rPr>
+                <w:rFonts w:asciiTheme="majorHAnsi" w:hAnsiTheme="majorHAnsi" w:cstheme="minorHAnsi"/>
+              </w:rPr>
+              <w:t>Weight Rating: 3</w:t>
+            </w:r>
+          </w:p>
+        </w:tc>
+      </w:tr>
+      <w:tr>
+        <w:tc>
+          <w:tcPr>
+            <w:tcW w:w="2582" w:type="dxa"/>
+            <w:tcBorders>
+              <w:bottom w:val="single" w:sz="4" w:space="0" w:color="auto"/>
+            </w:tcBorders>
+            <w:shd w:val="clear" w:color="auto" w:fill="984806" w:themeFill="accent6" w:themeFillShade="80"/>
+          </w:tcPr>
+          <w:p>
+            <w:pPr>
+              <w:rPr>
+                <w:rFonts w:asciiTheme="majorHAnsi" w:hAnsiTheme="majorHAnsi" w:cstheme="minorHAnsi"/>
+                <w:b/>
+                <w:bCs/>
+              </w:rPr>
+            </w:pPr>
+            <w:r>
+              <w:rPr>
+                <w:rFonts w:asciiTheme="majorHAnsi" w:hAnsiTheme="majorHAnsi" w:cstheme="minorHAnsi"/>
+                <w:b/>
+                <w:bCs/>
+                <w:color w:val="FFFFFF" w:themeColor="background1"/>
+              </w:rPr>
+              <w:lastRenderedPageBreak/>
+              <w:t>Holsters</w:t>
+            </w:r>
+          </w:p>
+        </w:tc>
+        <w:tc>
+          <w:tcPr>
+            <w:tcW w:w="2509" w:type="dxa"/>
+            <w:tcBorders>
+              <w:bottom w:val="single" w:sz="4" w:space="0" w:color="auto"/>
+            </w:tcBorders>
+            <w:shd w:val="clear" w:color="auto" w:fill="984806" w:themeFill="accent6" w:themeFillShade="80"/>
+          </w:tcPr>
+          <w:p>
+            <w:pPr>
+              <w:rPr>
+                <w:rFonts w:asciiTheme="majorHAnsi" w:hAnsiTheme="majorHAnsi" w:cstheme="minorHAnsi"/>
+              </w:rPr>
+            </w:pPr>
+          </w:p>
+        </w:tc>
+        <w:tc>
+          <w:tcPr>
+            <w:tcW w:w="2261" w:type="dxa"/>
+            <w:shd w:val="clear" w:color="auto" w:fill="984806" w:themeFill="accent6" w:themeFillShade="80"/>
+          </w:tcPr>
+          <w:p>
+            <w:pPr>
+              <w:rPr>
+                <w:rFonts w:asciiTheme="majorHAnsi" w:hAnsiTheme="majorHAnsi" w:cstheme="minorHAnsi"/>
+              </w:rPr>
+            </w:pPr>
+          </w:p>
+        </w:tc>
+        <w:tc>
+          <w:tcPr>
+            <w:tcW w:w="2224" w:type="dxa"/>
+            <w:shd w:val="clear" w:color="auto" w:fill="984806" w:themeFill="accent6" w:themeFillShade="80"/>
+          </w:tcPr>
+          <w:p>
+            <w:pPr>
+              <w:rPr>
+                <w:rFonts w:asciiTheme="majorHAnsi" w:hAnsiTheme="majorHAnsi" w:cstheme="minorHAnsi"/>
+              </w:rPr>
+            </w:pPr>
+          </w:p>
+        </w:tc>
+      </w:tr>
+      <w:tr>
+        <w:tc>
+          <w:tcPr>
+            <w:tcW w:w="2582" w:type="dxa"/>
+            <w:tcBorders>
+              <w:bottom w:val="single" w:sz="4" w:space="0" w:color="auto"/>
+            </w:tcBorders>
+            <w:shd w:val="clear" w:color="auto" w:fill="D9D9D9" w:themeFill="background1" w:themeFillShade="D9"/>
+          </w:tcPr>
+          <w:p>
+            <w:pPr>
+              <w:rPr>
+                <w:rFonts w:asciiTheme="majorHAnsi" w:hAnsiTheme="majorHAnsi" w:cstheme="minorHAnsi"/>
+                <w:b/>
+                <w:bCs/>
+              </w:rPr>
+            </w:pPr>
+            <w:r>
+              <w:rPr>
+                <w:rFonts w:asciiTheme="majorHAnsi" w:hAnsiTheme="majorHAnsi" w:cstheme="minorHAnsi"/>
+                <w:b/>
+                <w:bCs/>
+              </w:rPr>
+              <w:t>Name</w:t>
+            </w:r>
+          </w:p>
+        </w:tc>
+        <w:tc>
+          <w:tcPr>
+            <w:tcW w:w="2509" w:type="dxa"/>
+            <w:tcBorders>
+              <w:bottom w:val="single" w:sz="4" w:space="0" w:color="auto"/>
+            </w:tcBorders>
+            <w:shd w:val="clear" w:color="auto" w:fill="D9D9D9" w:themeFill="background1" w:themeFillShade="D9"/>
+          </w:tcPr>
+          <w:p>
+            <w:pPr>
+              <w:rPr>
+                <w:rFonts w:asciiTheme="majorHAnsi" w:hAnsiTheme="majorHAnsi" w:cstheme="minorHAnsi"/>
+              </w:rPr>
+            </w:pPr>
+            <w:r>
+              <w:rPr>
+                <w:rFonts w:asciiTheme="majorHAnsi" w:hAnsiTheme="majorHAnsi" w:cstheme="minorHAnsi"/>
+                <w:b/>
+                <w:bCs/>
+              </w:rPr>
+              <w:t>Rarity</w:t>
+            </w:r>
+            <w:r>
+              <w:rPr>
+                <w:rFonts w:asciiTheme="majorHAnsi" w:hAnsiTheme="majorHAnsi" w:cstheme="minorHAnsi"/>
+                <w:b/>
+                <w:bCs/>
+              </w:rPr>
+              <w:t xml:space="preserve"> &amp; Tag</w:t>
+            </w:r>
+          </w:p>
+        </w:tc>
+        <w:tc>
+          <w:tcPr>
+            <w:tcW w:w="2261" w:type="dxa"/>
+            <w:shd w:val="clear" w:color="auto" w:fill="D9D9D9" w:themeFill="background1" w:themeFillShade="D9"/>
+          </w:tcPr>
+          <w:p>
+            <w:pPr>
+              <w:rPr>
+                <w:rFonts w:asciiTheme="majorHAnsi" w:hAnsiTheme="majorHAnsi" w:cstheme="minorHAnsi"/>
+              </w:rPr>
+            </w:pPr>
+            <w:r>
+              <w:rPr>
+                <w:rFonts w:asciiTheme="majorHAnsi" w:hAnsiTheme="majorHAnsi" w:cstheme="minorHAnsi"/>
+                <w:b/>
+                <w:bCs/>
+              </w:rPr>
+              <w:t>Details</w:t>
+            </w:r>
+          </w:p>
+        </w:tc>
+        <w:tc>
+          <w:tcPr>
+            <w:tcW w:w="2224" w:type="dxa"/>
+            <w:shd w:val="clear" w:color="auto" w:fill="D9D9D9" w:themeFill="background1" w:themeFillShade="D9"/>
+          </w:tcPr>
+          <w:p>
+            <w:pPr>
+              <w:rPr>
+                <w:rFonts w:asciiTheme="majorHAnsi" w:hAnsiTheme="majorHAnsi" w:cstheme="minorHAnsi"/>
+              </w:rPr>
+            </w:pPr>
+            <w:r>
+              <w:rPr>
+                <w:rFonts w:asciiTheme="majorHAnsi" w:hAnsiTheme="majorHAnsi" w:cstheme="minorHAnsi"/>
+                <w:b/>
+                <w:bCs/>
+              </w:rPr>
+              <w:t>Storage &amp; Weight</w:t>
+            </w:r>
+          </w:p>
+        </w:tc>
+      </w:tr>
+      <w:tr>
+        <w:tc>
+          <w:tcPr>
+            <w:tcW w:w="2582" w:type="dxa"/>
+            <w:tcBorders>
+              <w:bottom w:val="single" w:sz="4" w:space="0" w:color="auto"/>
+            </w:tcBorders>
+          </w:tcPr>
+          <w:p>
+            <w:pPr>
+              <w:rPr>
+                <w:rFonts w:asciiTheme="majorHAnsi" w:hAnsiTheme="majorHAnsi" w:cstheme="minorHAnsi"/>
+              </w:rPr>
+            </w:pPr>
+            <w:r>
+              <w:rPr>
+                <w:rFonts w:asciiTheme="majorHAnsi" w:hAnsiTheme="majorHAnsi" w:cstheme="minorHAnsi"/>
+              </w:rPr>
+              <w:t>Drop Leg Holster</w:t>
+            </w:r>
+          </w:p>
+        </w:tc>
+        <w:tc>
+          <w:tcPr>
+            <w:tcW w:w="2509" w:type="dxa"/>
+            <w:tcBorders>
+              <w:bottom w:val="single" w:sz="4" w:space="0" w:color="auto"/>
+            </w:tcBorders>
+          </w:tcPr>
+          <w:p>
+            <w:pPr>
+              <w:rPr>
+                <w:rFonts w:asciiTheme="majorHAnsi" w:hAnsiTheme="majorHAnsi" w:cstheme="minorHAnsi"/>
+              </w:rPr>
+            </w:pPr>
+            <w:r>
+              <w:rPr>
+                <w:rFonts w:asciiTheme="majorHAnsi" w:hAnsiTheme="majorHAnsi" w:cstheme="minorHAnsi"/>
+              </w:rPr>
+              <w:t>Extremely</w:t>
+            </w:r>
+            <w:r>
+              <w:rPr>
+                <w:rFonts w:asciiTheme="majorHAnsi" w:hAnsiTheme="majorHAnsi" w:cstheme="minorHAnsi"/>
+              </w:rPr>
+              <w:t xml:space="preserve"> Rare</w:t>
+            </w:r>
+          </w:p>
+        </w:tc>
+        <w:tc>
+          <w:tcPr>
+            <w:tcW w:w="2261" w:type="dxa"/>
+          </w:tcPr>
+          <w:p>
+            <w:pPr>
+              <w:rPr>
+                <w:rFonts w:asciiTheme="majorHAnsi" w:hAnsiTheme="majorHAnsi" w:cstheme="minorHAnsi"/>
+              </w:rPr>
+            </w:pPr>
+            <w:r>
+              <w:rPr>
+                <w:rFonts w:asciiTheme="majorHAnsi" w:hAnsiTheme="majorHAnsi" w:cstheme="minorHAnsi"/>
+              </w:rPr>
+              <w:t>Drop leg holster for Pistols</w:t>
+            </w:r>
+          </w:p>
+          <w:p>
+            <w:pPr>
+              <w:rPr>
+                <w:rFonts w:asciiTheme="majorHAnsi" w:hAnsiTheme="majorHAnsi" w:cstheme="minorHAnsi"/>
+              </w:rPr>
+            </w:pPr>
+          </w:p>
+          <w:p>
+            <w:pPr>
+              <w:rPr>
+                <w:rFonts w:asciiTheme="majorHAnsi" w:hAnsiTheme="majorHAnsi" w:cstheme="minorHAnsi"/>
+              </w:rPr>
+            </w:pPr>
+            <w:r>
+              <w:rPr>
+                <w:rFonts w:asciiTheme="majorHAnsi" w:hAnsiTheme="majorHAnsi" w:cstheme="minorHAnsi"/>
+              </w:rPr>
+              <w:t xml:space="preserve">Reduces </w:t>
+            </w:r>
+            <w:proofErr w:type="gramStart"/>
+            <w:r>
+              <w:rPr>
+                <w:rFonts w:asciiTheme="majorHAnsi" w:hAnsiTheme="majorHAnsi" w:cstheme="minorHAnsi"/>
+              </w:rPr>
+              <w:t>equip</w:t>
+            </w:r>
+            <w:proofErr w:type="gramEnd"/>
+            <w:r>
+              <w:rPr>
+                <w:rFonts w:asciiTheme="majorHAnsi" w:hAnsiTheme="majorHAnsi" w:cstheme="minorHAnsi"/>
+              </w:rPr>
+              <w:t xml:space="preserve"> time for pistols</w:t>
+            </w:r>
+          </w:p>
+        </w:tc>
+        <w:tc>
+          <w:tcPr>
+            <w:tcW w:w="2224" w:type="dxa"/>
+          </w:tcPr>
+          <w:p>
+            <w:pPr>
+              <w:rPr>
+                <w:rFonts w:asciiTheme="majorHAnsi" w:hAnsiTheme="majorHAnsi" w:cstheme="minorHAnsi"/>
+              </w:rPr>
+            </w:pPr>
+            <w:r>
+              <w:rPr>
+                <w:rFonts w:asciiTheme="majorHAnsi" w:hAnsiTheme="majorHAnsi" w:cstheme="minorHAnsi"/>
+              </w:rPr>
+              <w:t>Large enough for a pistol</w:t>
+            </w:r>
+          </w:p>
+          <w:p>
+            <w:pPr>
+              <w:rPr>
+                <w:rFonts w:asciiTheme="majorHAnsi" w:hAnsiTheme="majorHAnsi" w:cstheme="minorHAnsi"/>
+              </w:rPr>
+            </w:pPr>
+          </w:p>
+          <w:p>
+            <w:pPr>
+              <w:rPr>
+                <w:rFonts w:asciiTheme="majorHAnsi" w:hAnsiTheme="majorHAnsi" w:cstheme="minorHAnsi"/>
+              </w:rPr>
+            </w:pPr>
+            <w:r>
+              <w:rPr>
+                <w:rFonts w:asciiTheme="majorHAnsi" w:hAnsiTheme="majorHAnsi" w:cstheme="minorHAnsi"/>
+              </w:rPr>
+              <w:t>Weight Rating: 1</w:t>
+            </w:r>
+          </w:p>
+        </w:tc>
+      </w:tr>
+      <w:tr>
+        <w:tc>
+          <w:tcPr>
+            <w:tcW w:w="2582" w:type="dxa"/>
+            <w:tcBorders>
+              <w:bottom w:val="single" w:sz="4" w:space="0" w:color="auto"/>
+            </w:tcBorders>
+          </w:tcPr>
+          <w:p>
+            <w:pPr>
+              <w:rPr>
+                <w:rFonts w:asciiTheme="majorHAnsi" w:hAnsiTheme="majorHAnsi" w:cstheme="minorHAnsi"/>
+              </w:rPr>
+            </w:pPr>
+            <w:r>
+              <w:rPr>
+                <w:rFonts w:asciiTheme="majorHAnsi" w:hAnsiTheme="majorHAnsi" w:cstheme="minorHAnsi"/>
+              </w:rPr>
+              <w:t>Gunslinger Holster</w:t>
+            </w:r>
+          </w:p>
+        </w:tc>
+        <w:tc>
+          <w:tcPr>
+            <w:tcW w:w="2509" w:type="dxa"/>
+            <w:tcBorders>
+              <w:bottom w:val="single" w:sz="4" w:space="0" w:color="auto"/>
+            </w:tcBorders>
+          </w:tcPr>
+          <w:p>
+            <w:pPr>
+              <w:rPr>
+                <w:rFonts w:asciiTheme="majorHAnsi" w:hAnsiTheme="majorHAnsi" w:cstheme="minorHAnsi"/>
+              </w:rPr>
+            </w:pPr>
+            <w:r>
+              <w:rPr>
+                <w:rFonts w:asciiTheme="majorHAnsi" w:hAnsiTheme="majorHAnsi" w:cstheme="minorHAnsi"/>
+              </w:rPr>
+              <w:t>Extremely Rare</w:t>
+            </w:r>
+          </w:p>
+        </w:tc>
+        <w:tc>
+          <w:tcPr>
+            <w:tcW w:w="2261" w:type="dxa"/>
+          </w:tcPr>
+          <w:p>
+            <w:pPr>
+              <w:rPr>
+                <w:rFonts w:asciiTheme="majorHAnsi" w:hAnsiTheme="majorHAnsi" w:cstheme="minorHAnsi"/>
+              </w:rPr>
+            </w:pPr>
+            <w:r>
+              <w:rPr>
+                <w:rFonts w:asciiTheme="majorHAnsi" w:hAnsiTheme="majorHAnsi" w:cstheme="minorHAnsi"/>
+              </w:rPr>
+              <w:t>Leather holster that has slots for bullets unique to it. Meant for revolvers</w:t>
+            </w:r>
+          </w:p>
+          <w:p>
+            <w:pPr>
+              <w:rPr>
+                <w:rFonts w:asciiTheme="majorHAnsi" w:hAnsiTheme="majorHAnsi" w:cstheme="minorHAnsi"/>
+              </w:rPr>
+            </w:pPr>
+          </w:p>
+          <w:p>
+            <w:pPr>
+              <w:rPr>
+                <w:rFonts w:asciiTheme="majorHAnsi" w:hAnsiTheme="majorHAnsi" w:cstheme="minorHAnsi"/>
+              </w:rPr>
+            </w:pPr>
+            <w:r>
+              <w:rPr>
+                <w:rFonts w:asciiTheme="majorHAnsi" w:hAnsiTheme="majorHAnsi" w:cstheme="minorHAnsi"/>
+              </w:rPr>
+              <w:t xml:space="preserve">Reduces </w:t>
+            </w:r>
+            <w:proofErr w:type="gramStart"/>
+            <w:r>
+              <w:rPr>
+                <w:rFonts w:asciiTheme="majorHAnsi" w:hAnsiTheme="majorHAnsi" w:cstheme="minorHAnsi"/>
+              </w:rPr>
+              <w:t>equip</w:t>
+            </w:r>
+            <w:proofErr w:type="gramEnd"/>
+            <w:r>
+              <w:rPr>
+                <w:rFonts w:asciiTheme="majorHAnsi" w:hAnsiTheme="majorHAnsi" w:cstheme="minorHAnsi"/>
+              </w:rPr>
+              <w:t xml:space="preserve"> time for pistols</w:t>
+            </w:r>
+          </w:p>
+        </w:tc>
+        <w:tc>
+          <w:tcPr>
+            <w:tcW w:w="2224" w:type="dxa"/>
+          </w:tcPr>
+          <w:p>
+            <w:pPr>
+              <w:rPr>
+                <w:rFonts w:asciiTheme="majorHAnsi" w:hAnsiTheme="majorHAnsi" w:cstheme="minorHAnsi"/>
+              </w:rPr>
+            </w:pPr>
+            <w:r>
+              <w:rPr>
+                <w:rFonts w:asciiTheme="majorHAnsi" w:hAnsiTheme="majorHAnsi" w:cstheme="minorHAnsi"/>
+              </w:rPr>
+              <w:t>Pistol/revolver sized</w:t>
+            </w:r>
+          </w:p>
+          <w:p>
+            <w:pPr>
+              <w:rPr>
+                <w:rFonts w:asciiTheme="majorHAnsi" w:hAnsiTheme="majorHAnsi" w:cstheme="minorHAnsi"/>
+              </w:rPr>
+            </w:pPr>
+          </w:p>
+          <w:p>
+            <w:pPr>
+              <w:rPr>
+                <w:rFonts w:asciiTheme="majorHAnsi" w:hAnsiTheme="majorHAnsi" w:cstheme="minorHAnsi"/>
+              </w:rPr>
+            </w:pPr>
+            <w:r>
+              <w:rPr>
+                <w:rFonts w:asciiTheme="majorHAnsi" w:hAnsiTheme="majorHAnsi" w:cstheme="minorHAnsi"/>
+              </w:rPr>
+              <w:t>Weight Rating: 1</w:t>
+            </w:r>
+          </w:p>
+        </w:tc>
+      </w:tr>
+      <w:tr>
+        <w:tc>
+          <w:tcPr>
+            <w:tcW w:w="2582" w:type="dxa"/>
+            <w:tcBorders>
+              <w:bottom w:val="single" w:sz="4" w:space="0" w:color="auto"/>
+            </w:tcBorders>
+          </w:tcPr>
+          <w:p>
+            <w:pPr>
+              <w:rPr>
+                <w:rFonts w:asciiTheme="majorHAnsi" w:hAnsiTheme="majorHAnsi" w:cstheme="minorHAnsi"/>
+              </w:rPr>
+            </w:pPr>
+            <w:r>
+              <w:rPr>
+                <w:rFonts w:asciiTheme="majorHAnsi" w:hAnsiTheme="majorHAnsi" w:cstheme="minorHAnsi"/>
+              </w:rPr>
+              <w:t>Shoulder Holster</w:t>
+            </w:r>
+          </w:p>
+        </w:tc>
+        <w:tc>
+          <w:tcPr>
+            <w:tcW w:w="2509" w:type="dxa"/>
+            <w:tcBorders>
+              <w:bottom w:val="single" w:sz="4" w:space="0" w:color="auto"/>
+            </w:tcBorders>
+          </w:tcPr>
+          <w:p>
+            <w:pPr>
+              <w:rPr>
+                <w:rFonts w:asciiTheme="majorHAnsi" w:hAnsiTheme="majorHAnsi" w:cstheme="minorHAnsi"/>
+              </w:rPr>
+            </w:pPr>
+            <w:r>
+              <w:rPr>
+                <w:rFonts w:asciiTheme="majorHAnsi" w:hAnsiTheme="majorHAnsi" w:cstheme="minorHAnsi"/>
+              </w:rPr>
+              <w:t>Extremely Rare</w:t>
+            </w:r>
+          </w:p>
+        </w:tc>
+        <w:tc>
+          <w:tcPr>
+            <w:tcW w:w="2261" w:type="dxa"/>
+          </w:tcPr>
+          <w:p>
+            <w:pPr>
+              <w:rPr>
+                <w:rFonts w:asciiTheme="majorHAnsi" w:hAnsiTheme="majorHAnsi" w:cstheme="minorHAnsi"/>
+              </w:rPr>
+            </w:pPr>
+            <w:r>
+              <w:rPr>
+                <w:rFonts w:asciiTheme="majorHAnsi" w:hAnsiTheme="majorHAnsi" w:cstheme="minorHAnsi"/>
+              </w:rPr>
+              <w:t>Leather shoulder holster that has storage for magazines and a pistol that rests underneath the character’s arms</w:t>
+            </w:r>
+          </w:p>
+          <w:p>
+            <w:pPr>
+              <w:rPr>
+                <w:rFonts w:asciiTheme="majorHAnsi" w:hAnsiTheme="majorHAnsi" w:cstheme="minorHAnsi"/>
+              </w:rPr>
+            </w:pPr>
+          </w:p>
+          <w:p>
+            <w:pPr>
+              <w:rPr>
+                <w:rFonts w:asciiTheme="majorHAnsi" w:hAnsiTheme="majorHAnsi" w:cstheme="minorHAnsi"/>
+              </w:rPr>
+            </w:pPr>
+            <w:r>
+              <w:rPr>
+                <w:rFonts w:asciiTheme="majorHAnsi" w:hAnsiTheme="majorHAnsi" w:cstheme="minorHAnsi"/>
+              </w:rPr>
+              <w:t>Reduces Equip time for pistols and reduces reload time</w:t>
+            </w:r>
+          </w:p>
+        </w:tc>
+        <w:tc>
+          <w:tcPr>
+            <w:tcW w:w="2224" w:type="dxa"/>
+          </w:tcPr>
+          <w:p>
+            <w:pPr>
+              <w:rPr>
+                <w:rFonts w:asciiTheme="majorHAnsi" w:hAnsiTheme="majorHAnsi" w:cstheme="minorHAnsi"/>
+              </w:rPr>
+            </w:pPr>
+            <w:r>
+              <w:rPr>
+                <w:rFonts w:asciiTheme="majorHAnsi" w:hAnsiTheme="majorHAnsi" w:cstheme="minorHAnsi"/>
+              </w:rPr>
+              <w:t>Large enough for a pistol and 2 magazines</w:t>
+            </w:r>
+          </w:p>
+          <w:p>
+            <w:pPr>
+              <w:rPr>
+                <w:rFonts w:asciiTheme="majorHAnsi" w:hAnsiTheme="majorHAnsi" w:cstheme="minorHAnsi"/>
+              </w:rPr>
+            </w:pPr>
+          </w:p>
+          <w:p>
+            <w:pPr>
+              <w:rPr>
+                <w:rFonts w:asciiTheme="majorHAnsi" w:hAnsiTheme="majorHAnsi" w:cstheme="minorHAnsi"/>
+              </w:rPr>
+            </w:pPr>
+            <w:r>
+              <w:rPr>
+                <w:rFonts w:asciiTheme="majorHAnsi" w:hAnsiTheme="majorHAnsi" w:cstheme="minorHAnsi"/>
+              </w:rPr>
+              <w:t>Weight Rating: 1</w:t>
+            </w:r>
+          </w:p>
+        </w:tc>
+      </w:tr>
+      <w:tr>
+        <w:tc>
+          <w:tcPr>
+            <w:tcW w:w="2582" w:type="dxa"/>
+            <w:tcBorders>
+              <w:bottom w:val="single" w:sz="4" w:space="0" w:color="auto"/>
+            </w:tcBorders>
+          </w:tcPr>
+          <w:p>
+            <w:pPr>
+              <w:rPr>
+                <w:rFonts w:asciiTheme="majorHAnsi" w:hAnsiTheme="majorHAnsi" w:cstheme="minorHAnsi"/>
+              </w:rPr>
+            </w:pPr>
+            <w:r>
+              <w:rPr>
+                <w:rFonts w:asciiTheme="majorHAnsi" w:hAnsiTheme="majorHAnsi" w:cstheme="minorHAnsi"/>
+              </w:rPr>
+              <w:t>Knife Holster/scabbard</w:t>
+            </w:r>
+          </w:p>
+        </w:tc>
+        <w:tc>
+          <w:tcPr>
+            <w:tcW w:w="2509" w:type="dxa"/>
+            <w:tcBorders>
+              <w:bottom w:val="single" w:sz="4" w:space="0" w:color="auto"/>
+            </w:tcBorders>
+          </w:tcPr>
+          <w:p>
+            <w:pPr>
+              <w:rPr>
+                <w:rFonts w:asciiTheme="majorHAnsi" w:hAnsiTheme="majorHAnsi" w:cstheme="minorHAnsi"/>
+              </w:rPr>
+            </w:pPr>
+            <w:r>
+              <w:rPr>
+                <w:rFonts w:asciiTheme="majorHAnsi" w:hAnsiTheme="majorHAnsi" w:cstheme="minorHAnsi"/>
+              </w:rPr>
+              <w:t>Very rare</w:t>
+            </w:r>
+          </w:p>
+        </w:tc>
+        <w:tc>
+          <w:tcPr>
+            <w:tcW w:w="2261" w:type="dxa"/>
+          </w:tcPr>
+          <w:p>
+            <w:pPr>
+              <w:rPr>
+                <w:rFonts w:asciiTheme="majorHAnsi" w:hAnsiTheme="majorHAnsi" w:cstheme="minorHAnsi"/>
+              </w:rPr>
+            </w:pPr>
+            <w:r>
+              <w:rPr>
+                <w:rFonts w:asciiTheme="majorHAnsi" w:hAnsiTheme="majorHAnsi" w:cstheme="minorHAnsi"/>
+              </w:rPr>
+              <w:t>A holster for a knife that can attach to the arm or legs</w:t>
+            </w:r>
+          </w:p>
+          <w:p>
+            <w:pPr>
+              <w:rPr>
+                <w:rFonts w:asciiTheme="majorHAnsi" w:hAnsiTheme="majorHAnsi" w:cstheme="minorHAnsi"/>
+              </w:rPr>
+            </w:pPr>
+          </w:p>
+          <w:p>
+            <w:pPr>
+              <w:rPr>
+                <w:rFonts w:asciiTheme="majorHAnsi" w:hAnsiTheme="majorHAnsi" w:cstheme="minorHAnsi"/>
+              </w:rPr>
+            </w:pPr>
+            <w:r>
+              <w:rPr>
+                <w:rFonts w:asciiTheme="majorHAnsi" w:hAnsiTheme="majorHAnsi" w:cstheme="minorHAnsi"/>
+              </w:rPr>
+              <w:t xml:space="preserve">Reduces </w:t>
+            </w:r>
+            <w:proofErr w:type="gramStart"/>
+            <w:r>
+              <w:rPr>
+                <w:rFonts w:asciiTheme="majorHAnsi" w:hAnsiTheme="majorHAnsi" w:cstheme="minorHAnsi"/>
+              </w:rPr>
+              <w:t>equip</w:t>
+            </w:r>
+            <w:proofErr w:type="gramEnd"/>
+            <w:r>
+              <w:rPr>
+                <w:rFonts w:asciiTheme="majorHAnsi" w:hAnsiTheme="majorHAnsi" w:cstheme="minorHAnsi"/>
+              </w:rPr>
+              <w:t xml:space="preserve"> time for the knife</w:t>
+            </w:r>
+          </w:p>
+        </w:tc>
+        <w:tc>
+          <w:tcPr>
+            <w:tcW w:w="2224" w:type="dxa"/>
+          </w:tcPr>
+          <w:p>
+            <w:pPr>
+              <w:rPr>
+                <w:rFonts w:asciiTheme="majorHAnsi" w:hAnsiTheme="majorHAnsi" w:cstheme="minorHAnsi"/>
+              </w:rPr>
+            </w:pPr>
+            <w:r>
+              <w:rPr>
+                <w:rFonts w:asciiTheme="majorHAnsi" w:hAnsiTheme="majorHAnsi" w:cstheme="minorHAnsi"/>
+              </w:rPr>
+              <w:t>Fits a knife</w:t>
+            </w:r>
+          </w:p>
+          <w:p>
+            <w:pPr>
+              <w:rPr>
+                <w:rFonts w:asciiTheme="majorHAnsi" w:hAnsiTheme="majorHAnsi" w:cstheme="minorHAnsi"/>
+              </w:rPr>
+            </w:pPr>
+          </w:p>
+          <w:p>
+            <w:pPr>
+              <w:rPr>
+                <w:rFonts w:asciiTheme="majorHAnsi" w:hAnsiTheme="majorHAnsi" w:cstheme="minorHAnsi"/>
+              </w:rPr>
+            </w:pPr>
+            <w:r>
+              <w:rPr>
+                <w:rFonts w:asciiTheme="majorHAnsi" w:hAnsiTheme="majorHAnsi" w:cstheme="minorHAnsi"/>
+              </w:rPr>
+              <w:t>Weight Rating: 0</w:t>
+            </w:r>
+          </w:p>
+        </w:tc>
+      </w:tr>
+      <w:tr>
+        <w:tc>
+          <w:tcPr>
+            <w:tcW w:w="2582" w:type="dxa"/>
+            <w:tcBorders>
+              <w:bottom w:val="single" w:sz="4" w:space="0" w:color="auto"/>
+            </w:tcBorders>
+            <w:shd w:val="clear" w:color="auto" w:fill="4A442A" w:themeFill="background2" w:themeFillShade="40"/>
+          </w:tcPr>
+          <w:p>
+            <w:pPr>
+              <w:rPr>
+                <w:rFonts w:asciiTheme="majorHAnsi" w:hAnsiTheme="majorHAnsi" w:cstheme="minorHAnsi"/>
+                <w:b/>
+                <w:bCs/>
+              </w:rPr>
+            </w:pPr>
+            <w:r>
+              <w:rPr>
+                <w:rFonts w:asciiTheme="majorHAnsi" w:hAnsiTheme="majorHAnsi" w:cstheme="minorHAnsi"/>
+                <w:b/>
+                <w:bCs/>
+                <w:color w:val="FFFFFF" w:themeColor="background1"/>
+              </w:rPr>
+              <w:t>Jackets</w:t>
+            </w:r>
+          </w:p>
+        </w:tc>
+        <w:tc>
+          <w:tcPr>
+            <w:tcW w:w="2509" w:type="dxa"/>
+            <w:tcBorders>
+              <w:bottom w:val="single" w:sz="4" w:space="0" w:color="auto"/>
+            </w:tcBorders>
+            <w:shd w:val="clear" w:color="auto" w:fill="4A442A" w:themeFill="background2" w:themeFillShade="40"/>
+          </w:tcPr>
+          <w:p>
+            <w:pPr>
+              <w:rPr>
+                <w:rFonts w:asciiTheme="majorHAnsi" w:hAnsiTheme="majorHAnsi" w:cstheme="minorHAnsi"/>
+              </w:rPr>
+            </w:pPr>
+          </w:p>
+        </w:tc>
+        <w:tc>
+          <w:tcPr>
+            <w:tcW w:w="2261" w:type="dxa"/>
+            <w:shd w:val="clear" w:color="auto" w:fill="4A442A" w:themeFill="background2" w:themeFillShade="40"/>
+          </w:tcPr>
+          <w:p>
+            <w:pPr>
+              <w:rPr>
+                <w:rFonts w:asciiTheme="majorHAnsi" w:hAnsiTheme="majorHAnsi" w:cstheme="minorHAnsi"/>
+              </w:rPr>
+            </w:pPr>
+          </w:p>
+        </w:tc>
+        <w:tc>
+          <w:tcPr>
+            <w:tcW w:w="2224" w:type="dxa"/>
+            <w:shd w:val="clear" w:color="auto" w:fill="4A442A" w:themeFill="background2" w:themeFillShade="40"/>
+          </w:tcPr>
+          <w:p>
+            <w:pPr>
+              <w:rPr>
+                <w:rFonts w:asciiTheme="majorHAnsi" w:hAnsiTheme="majorHAnsi" w:cstheme="minorHAnsi"/>
+              </w:rPr>
+            </w:pPr>
+          </w:p>
+        </w:tc>
+      </w:tr>
+      <w:tr>
+        <w:tc>
+          <w:tcPr>
+            <w:tcW w:w="2582" w:type="dxa"/>
+            <w:tcBorders>
+              <w:bottom w:val="single" w:sz="4" w:space="0" w:color="auto"/>
+            </w:tcBorders>
+            <w:shd w:val="clear" w:color="auto" w:fill="D9D9D9" w:themeFill="background1" w:themeFillShade="D9"/>
+          </w:tcPr>
+          <w:p>
+            <w:pPr>
+              <w:rPr>
+                <w:rFonts w:asciiTheme="majorHAnsi" w:hAnsiTheme="majorHAnsi" w:cstheme="minorHAnsi"/>
+                <w:b/>
+                <w:bCs/>
+              </w:rPr>
+            </w:pPr>
+            <w:r>
+              <w:rPr>
+                <w:rFonts w:asciiTheme="majorHAnsi" w:hAnsiTheme="majorHAnsi" w:cstheme="minorHAnsi"/>
+                <w:b/>
+                <w:bCs/>
+              </w:rPr>
+              <w:t>Name</w:t>
+            </w:r>
+          </w:p>
+        </w:tc>
+        <w:tc>
+          <w:tcPr>
+            <w:tcW w:w="2509" w:type="dxa"/>
+            <w:tcBorders>
+              <w:bottom w:val="single" w:sz="4" w:space="0" w:color="auto"/>
+            </w:tcBorders>
+            <w:shd w:val="clear" w:color="auto" w:fill="D9D9D9" w:themeFill="background1" w:themeFillShade="D9"/>
+          </w:tcPr>
+          <w:p>
+            <w:pPr>
+              <w:rPr>
+                <w:rFonts w:asciiTheme="majorHAnsi" w:hAnsiTheme="majorHAnsi" w:cstheme="minorHAnsi"/>
+                <w:b/>
+                <w:bCs/>
+              </w:rPr>
+            </w:pPr>
+            <w:r>
+              <w:rPr>
+                <w:rFonts w:asciiTheme="majorHAnsi" w:hAnsiTheme="majorHAnsi" w:cstheme="minorHAnsi"/>
+                <w:b/>
+                <w:bCs/>
+              </w:rPr>
+              <w:t>Rarity &amp; Tag</w:t>
+            </w:r>
+          </w:p>
+        </w:tc>
+        <w:tc>
+          <w:tcPr>
+            <w:tcW w:w="2261" w:type="dxa"/>
+            <w:shd w:val="clear" w:color="auto" w:fill="D9D9D9" w:themeFill="background1" w:themeFillShade="D9"/>
+          </w:tcPr>
+          <w:p>
+            <w:pPr>
+              <w:rPr>
+                <w:rFonts w:asciiTheme="majorHAnsi" w:hAnsiTheme="majorHAnsi" w:cstheme="minorHAnsi"/>
+                <w:b/>
+                <w:bCs/>
+              </w:rPr>
+            </w:pPr>
+            <w:r>
+              <w:rPr>
+                <w:rFonts w:asciiTheme="majorHAnsi" w:hAnsiTheme="majorHAnsi" w:cstheme="minorHAnsi"/>
+                <w:b/>
+                <w:bCs/>
+              </w:rPr>
+              <w:t>Details</w:t>
+            </w:r>
+          </w:p>
+        </w:tc>
+        <w:tc>
+          <w:tcPr>
+            <w:tcW w:w="2224" w:type="dxa"/>
+            <w:shd w:val="clear" w:color="auto" w:fill="D9D9D9" w:themeFill="background1" w:themeFillShade="D9"/>
+          </w:tcPr>
+          <w:p>
+            <w:pPr>
+              <w:rPr>
+                <w:rFonts w:asciiTheme="majorHAnsi" w:hAnsiTheme="majorHAnsi" w:cstheme="minorHAnsi"/>
+                <w:b/>
+                <w:bCs/>
+              </w:rPr>
+            </w:pPr>
+            <w:r>
+              <w:rPr>
+                <w:rFonts w:asciiTheme="majorHAnsi" w:hAnsiTheme="majorHAnsi" w:cstheme="minorHAnsi"/>
+                <w:b/>
+                <w:bCs/>
+              </w:rPr>
+              <w:t>Storage</w:t>
+            </w:r>
+            <w:r>
+              <w:rPr>
+                <w:rFonts w:asciiTheme="majorHAnsi" w:hAnsiTheme="majorHAnsi" w:cstheme="minorHAnsi"/>
+                <w:b/>
+                <w:bCs/>
+              </w:rPr>
+              <w:t>,</w:t>
+            </w:r>
+            <w:r>
+              <w:rPr>
+                <w:rFonts w:asciiTheme="majorHAnsi" w:hAnsiTheme="majorHAnsi" w:cstheme="minorHAnsi"/>
+                <w:b/>
+                <w:bCs/>
+              </w:rPr>
+              <w:t xml:space="preserve"> Weight</w:t>
+            </w:r>
+            <w:r>
+              <w:rPr>
+                <w:rFonts w:asciiTheme="majorHAnsi" w:hAnsiTheme="majorHAnsi" w:cstheme="minorHAnsi"/>
+                <w:b/>
+                <w:bCs/>
+              </w:rPr>
+              <w:t>, AR</w:t>
+            </w:r>
+          </w:p>
+        </w:tc>
+      </w:tr>
+      <w:tr>
+        <w:tc>
+          <w:tcPr>
+            <w:tcW w:w="2582" w:type="dxa"/>
+            <w:tcBorders>
+              <w:bottom w:val="single" w:sz="4" w:space="0" w:color="auto"/>
+            </w:tcBorders>
+          </w:tcPr>
+          <w:p>
+            <w:pPr>
+              <w:rPr>
+                <w:rFonts w:asciiTheme="majorHAnsi" w:hAnsiTheme="majorHAnsi" w:cstheme="minorHAnsi"/>
+              </w:rPr>
+            </w:pPr>
+            <w:r>
+              <w:rPr>
+                <w:rFonts w:asciiTheme="majorHAnsi" w:hAnsiTheme="majorHAnsi" w:cstheme="minorHAnsi"/>
+              </w:rPr>
+              <w:t>Rain Jacket</w:t>
+            </w:r>
+          </w:p>
+          <w:p>
+            <w:pPr>
+              <w:rPr>
+                <w:rFonts w:asciiTheme="majorHAnsi" w:hAnsiTheme="majorHAnsi" w:cstheme="minorHAnsi"/>
+              </w:rPr>
+            </w:pPr>
+          </w:p>
+          <w:p>
+            <w:pPr>
+              <w:rPr>
+                <w:rFonts w:asciiTheme="majorHAnsi" w:hAnsiTheme="majorHAnsi" w:cstheme="minorHAnsi"/>
+              </w:rPr>
+            </w:pPr>
+          </w:p>
+          <w:p>
+            <w:pPr>
+              <w:rPr>
+                <w:rFonts w:asciiTheme="majorHAnsi" w:hAnsiTheme="majorHAnsi" w:cstheme="minorHAnsi"/>
+              </w:rPr>
+            </w:pPr>
+          </w:p>
+          <w:p>
+            <w:pPr>
+              <w:rPr>
+                <w:rFonts w:asciiTheme="majorHAnsi" w:hAnsiTheme="majorHAnsi" w:cstheme="minorHAnsi"/>
+              </w:rPr>
+            </w:pPr>
+          </w:p>
+          <w:p>
+            <w:pPr>
+              <w:rPr>
+                <w:rFonts w:asciiTheme="majorHAnsi" w:hAnsiTheme="majorHAnsi" w:cstheme="minorHAnsi"/>
+              </w:rPr>
+            </w:pPr>
+          </w:p>
+          <w:p>
+            <w:pPr>
+              <w:rPr>
+                <w:rFonts w:asciiTheme="majorHAnsi" w:hAnsiTheme="majorHAnsi" w:cstheme="minorHAnsi"/>
+              </w:rPr>
+            </w:pPr>
+          </w:p>
+          <w:p>
+            <w:pPr>
+              <w:rPr>
+                <w:rFonts w:asciiTheme="majorHAnsi" w:hAnsiTheme="majorHAnsi" w:cstheme="minorHAnsi"/>
+              </w:rPr>
+            </w:pPr>
+          </w:p>
+          <w:p>
+            <w:pPr>
+              <w:rPr>
+                <w:rFonts w:asciiTheme="majorHAnsi" w:hAnsiTheme="majorHAnsi" w:cstheme="minorHAnsi"/>
+              </w:rPr>
+            </w:pPr>
+          </w:p>
+          <w:p>
+            <w:pPr>
+              <w:rPr>
+                <w:rFonts w:asciiTheme="majorHAnsi" w:hAnsiTheme="majorHAnsi" w:cstheme="minorHAnsi"/>
+              </w:rPr>
+            </w:pPr>
+          </w:p>
+        </w:tc>
+        <w:tc>
+          <w:tcPr>
+            <w:tcW w:w="2509" w:type="dxa"/>
+            <w:tcBorders>
+              <w:bottom w:val="single" w:sz="4" w:space="0" w:color="auto"/>
+            </w:tcBorders>
+          </w:tcPr>
+          <w:p>
+            <w:pPr>
+              <w:rPr>
+                <w:rFonts w:asciiTheme="majorHAnsi" w:hAnsiTheme="majorHAnsi" w:cstheme="minorHAnsi"/>
+              </w:rPr>
+            </w:pPr>
+            <w:r>
+              <w:rPr>
+                <w:rFonts w:asciiTheme="majorHAnsi" w:hAnsiTheme="majorHAnsi" w:cstheme="minorHAnsi"/>
+              </w:rPr>
+              <w:t>Rare</w:t>
+            </w:r>
+          </w:p>
+        </w:tc>
+        <w:tc>
+          <w:tcPr>
+            <w:tcW w:w="2261" w:type="dxa"/>
+          </w:tcPr>
+          <w:p>
+            <w:pPr>
+              <w:rPr>
+                <w:rFonts w:asciiTheme="majorHAnsi" w:hAnsiTheme="majorHAnsi" w:cstheme="minorHAnsi"/>
+              </w:rPr>
+            </w:pPr>
+            <w:r>
+              <w:rPr>
+                <w:rFonts w:asciiTheme="majorHAnsi" w:hAnsiTheme="majorHAnsi" w:cstheme="minorHAnsi"/>
+              </w:rPr>
+              <w:t xml:space="preserve">Jacket </w:t>
+            </w:r>
+            <w:proofErr w:type="gramStart"/>
+            <w:r>
+              <w:rPr>
+                <w:rFonts w:asciiTheme="majorHAnsi" w:hAnsiTheme="majorHAnsi" w:cstheme="minorHAnsi"/>
+              </w:rPr>
+              <w:t>made out of</w:t>
+            </w:r>
+            <w:proofErr w:type="gramEnd"/>
+            <w:r>
+              <w:rPr>
+                <w:rFonts w:asciiTheme="majorHAnsi" w:hAnsiTheme="majorHAnsi" w:cstheme="minorHAnsi"/>
+              </w:rPr>
+              <w:t xml:space="preserve"> </w:t>
+            </w:r>
+            <w:proofErr w:type="gramStart"/>
+            <w:r>
+              <w:rPr>
+                <w:rFonts w:asciiTheme="majorHAnsi" w:hAnsiTheme="majorHAnsi" w:cstheme="minorHAnsi"/>
+              </w:rPr>
+              <w:t>water proof</w:t>
+            </w:r>
+            <w:proofErr w:type="gramEnd"/>
+            <w:r>
+              <w:rPr>
+                <w:rFonts w:asciiTheme="majorHAnsi" w:hAnsiTheme="majorHAnsi" w:cstheme="minorHAnsi"/>
+              </w:rPr>
+              <w:t xml:space="preserve"> material</w:t>
+            </w:r>
+          </w:p>
+          <w:p>
+            <w:pPr>
+              <w:rPr>
+                <w:rFonts w:asciiTheme="majorHAnsi" w:hAnsiTheme="majorHAnsi" w:cstheme="minorHAnsi"/>
+              </w:rPr>
+            </w:pPr>
+          </w:p>
+          <w:p>
+            <w:pPr>
+              <w:rPr>
+                <w:rFonts w:asciiTheme="majorHAnsi" w:hAnsiTheme="majorHAnsi" w:cstheme="minorHAnsi"/>
+              </w:rPr>
+            </w:pPr>
+            <w:r>
+              <w:rPr>
+                <w:rFonts w:asciiTheme="majorHAnsi" w:hAnsiTheme="majorHAnsi" w:cstheme="minorHAnsi"/>
+              </w:rPr>
+              <w:t>Reduces Wet accumulation by 50%</w:t>
+            </w:r>
+          </w:p>
+        </w:tc>
+        <w:tc>
+          <w:tcPr>
+            <w:tcW w:w="2224" w:type="dxa"/>
+          </w:tcPr>
+          <w:p>
+            <w:pPr>
+              <w:rPr>
+                <w:rFonts w:asciiTheme="majorHAnsi" w:hAnsiTheme="majorHAnsi" w:cstheme="minorHAnsi"/>
+                <w:b/>
+                <w:bCs/>
+              </w:rPr>
+            </w:pPr>
+            <w:r>
+              <w:rPr>
+                <w:rFonts w:asciiTheme="majorHAnsi" w:hAnsiTheme="majorHAnsi" w:cstheme="minorHAnsi"/>
+                <w:b/>
+                <w:bCs/>
+              </w:rPr>
+              <w:t>Storage: Very Low</w:t>
+            </w:r>
+          </w:p>
+          <w:p>
+            <w:pPr>
+              <w:rPr>
+                <w:rFonts w:asciiTheme="majorHAnsi" w:hAnsiTheme="majorHAnsi" w:cstheme="minorHAnsi"/>
+                <w:b/>
+                <w:bCs/>
+              </w:rPr>
+            </w:pPr>
+          </w:p>
+          <w:p>
+            <w:pPr>
+              <w:rPr>
+                <w:rFonts w:asciiTheme="majorHAnsi" w:hAnsiTheme="majorHAnsi" w:cstheme="minorHAnsi"/>
+                <w:b/>
+                <w:bCs/>
+              </w:rPr>
+            </w:pPr>
+            <w:r>
+              <w:rPr>
+                <w:rFonts w:asciiTheme="majorHAnsi" w:hAnsiTheme="majorHAnsi" w:cstheme="minorHAnsi"/>
+                <w:b/>
+                <w:bCs/>
+              </w:rPr>
+              <w:t>AR: 1</w:t>
+            </w:r>
+          </w:p>
+          <w:p>
+            <w:pPr>
+              <w:rPr>
+                <w:rFonts w:asciiTheme="majorHAnsi" w:hAnsiTheme="majorHAnsi" w:cstheme="minorHAnsi"/>
+                <w:b/>
+                <w:bCs/>
+              </w:rPr>
+            </w:pPr>
+          </w:p>
+          <w:p>
+            <w:pPr>
+              <w:rPr>
+                <w:rFonts w:asciiTheme="majorHAnsi" w:hAnsiTheme="majorHAnsi" w:cstheme="minorHAnsi"/>
+                <w:b/>
+                <w:bCs/>
+              </w:rPr>
+            </w:pPr>
+            <w:r>
+              <w:rPr>
+                <w:rFonts w:asciiTheme="majorHAnsi" w:hAnsiTheme="majorHAnsi" w:cstheme="minorHAnsi"/>
+                <w:b/>
+                <w:bCs/>
+              </w:rPr>
+              <w:t>Weight Rating: 1</w:t>
+            </w:r>
+          </w:p>
+        </w:tc>
+      </w:tr>
+      <w:tr>
+        <w:tc>
+          <w:tcPr>
+            <w:tcW w:w="2582" w:type="dxa"/>
+            <w:tcBorders>
+              <w:bottom w:val="single" w:sz="4" w:space="0" w:color="auto"/>
+            </w:tcBorders>
+          </w:tcPr>
+          <w:p>
+            <w:pPr>
+              <w:rPr>
+                <w:rFonts w:asciiTheme="majorHAnsi" w:hAnsiTheme="majorHAnsi" w:cstheme="minorHAnsi"/>
+              </w:rPr>
+            </w:pPr>
+            <w:r>
+              <w:rPr>
+                <w:rFonts w:asciiTheme="majorHAnsi" w:hAnsiTheme="majorHAnsi" w:cstheme="minorHAnsi"/>
+              </w:rPr>
+              <w:lastRenderedPageBreak/>
+              <w:t>Winter Jacket</w:t>
+            </w:r>
+          </w:p>
+        </w:tc>
+        <w:tc>
+          <w:tcPr>
+            <w:tcW w:w="2509" w:type="dxa"/>
+            <w:tcBorders>
+              <w:bottom w:val="single" w:sz="4" w:space="0" w:color="auto"/>
+            </w:tcBorders>
+          </w:tcPr>
+          <w:p>
+            <w:pPr>
+              <w:rPr>
+                <w:rFonts w:asciiTheme="majorHAnsi" w:hAnsiTheme="majorHAnsi" w:cstheme="minorHAnsi"/>
+              </w:rPr>
+            </w:pPr>
+            <w:r>
+              <w:rPr>
+                <w:rFonts w:asciiTheme="majorHAnsi" w:hAnsiTheme="majorHAnsi" w:cstheme="minorHAnsi"/>
+              </w:rPr>
+              <w:t>Rare</w:t>
+            </w:r>
+          </w:p>
+        </w:tc>
+        <w:tc>
+          <w:tcPr>
+            <w:tcW w:w="2261" w:type="dxa"/>
+          </w:tcPr>
+          <w:p>
+            <w:pPr>
+              <w:rPr>
+                <w:rFonts w:asciiTheme="majorHAnsi" w:hAnsiTheme="majorHAnsi" w:cstheme="minorHAnsi"/>
+              </w:rPr>
+            </w:pPr>
+            <w:r>
+              <w:rPr>
+                <w:rFonts w:asciiTheme="majorHAnsi" w:hAnsiTheme="majorHAnsi" w:cstheme="minorHAnsi"/>
+              </w:rPr>
+              <w:t>Jacket that keeps the player warm in winter conditions</w:t>
+            </w:r>
+          </w:p>
+          <w:p>
+            <w:pPr>
+              <w:rPr>
+                <w:rFonts w:asciiTheme="majorHAnsi" w:hAnsiTheme="majorHAnsi" w:cstheme="minorHAnsi"/>
+              </w:rPr>
+            </w:pPr>
+          </w:p>
+          <w:p>
+            <w:pPr>
+              <w:rPr>
+                <w:rFonts w:asciiTheme="majorHAnsi" w:hAnsiTheme="majorHAnsi" w:cstheme="minorHAnsi"/>
+              </w:rPr>
+            </w:pPr>
+            <w:r>
+              <w:rPr>
+                <w:rFonts w:asciiTheme="majorHAnsi" w:hAnsiTheme="majorHAnsi" w:cstheme="minorHAnsi"/>
+              </w:rPr>
+              <w:t>Helps prevent the player from accumulating cold</w:t>
+            </w:r>
+          </w:p>
+        </w:tc>
+        <w:tc>
+          <w:tcPr>
+            <w:tcW w:w="2224" w:type="dxa"/>
+          </w:tcPr>
+          <w:p>
+            <w:pPr>
+              <w:rPr>
+                <w:rFonts w:asciiTheme="majorHAnsi" w:hAnsiTheme="majorHAnsi" w:cstheme="minorHAnsi"/>
+              </w:rPr>
+            </w:pPr>
+            <w:r>
+              <w:rPr>
+                <w:rFonts w:asciiTheme="majorHAnsi" w:hAnsiTheme="majorHAnsi" w:cstheme="minorHAnsi"/>
+              </w:rPr>
+              <w:t>Storage: Low</w:t>
+            </w:r>
+          </w:p>
+          <w:p>
+            <w:pPr>
+              <w:rPr>
+                <w:rFonts w:asciiTheme="majorHAnsi" w:hAnsiTheme="majorHAnsi" w:cstheme="minorHAnsi"/>
+              </w:rPr>
+            </w:pPr>
+          </w:p>
+          <w:p>
+            <w:pPr>
+              <w:rPr>
+                <w:rFonts w:asciiTheme="majorHAnsi" w:hAnsiTheme="majorHAnsi" w:cstheme="minorHAnsi"/>
+              </w:rPr>
+            </w:pPr>
+            <w:r>
+              <w:rPr>
+                <w:rFonts w:asciiTheme="majorHAnsi" w:hAnsiTheme="majorHAnsi" w:cstheme="minorHAnsi"/>
+              </w:rPr>
+              <w:t>AR: 2</w:t>
+            </w:r>
+          </w:p>
+          <w:p>
+            <w:pPr>
+              <w:rPr>
+                <w:rFonts w:asciiTheme="majorHAnsi" w:hAnsiTheme="majorHAnsi" w:cstheme="minorHAnsi"/>
+              </w:rPr>
+            </w:pPr>
+          </w:p>
+          <w:p>
+            <w:pPr>
+              <w:rPr>
+                <w:rFonts w:asciiTheme="majorHAnsi" w:hAnsiTheme="majorHAnsi" w:cstheme="minorHAnsi"/>
+              </w:rPr>
+            </w:pPr>
+            <w:r>
+              <w:rPr>
+                <w:rFonts w:asciiTheme="majorHAnsi" w:hAnsiTheme="majorHAnsi" w:cstheme="minorHAnsi"/>
+              </w:rPr>
+              <w:t>Weight Rating: 2</w:t>
+            </w:r>
+          </w:p>
+        </w:tc>
+      </w:tr>
+      <w:tr>
+        <w:tc>
+          <w:tcPr>
+            <w:tcW w:w="2582" w:type="dxa"/>
+            <w:tcBorders>
+              <w:bottom w:val="single" w:sz="4" w:space="0" w:color="auto"/>
+            </w:tcBorders>
+          </w:tcPr>
+          <w:p>
+            <w:pPr>
+              <w:rPr>
+                <w:rFonts w:asciiTheme="majorHAnsi" w:hAnsiTheme="majorHAnsi" w:cstheme="minorHAnsi"/>
+              </w:rPr>
+            </w:pPr>
+            <w:r>
+              <w:rPr>
+                <w:rFonts w:asciiTheme="majorHAnsi" w:hAnsiTheme="majorHAnsi" w:cstheme="minorHAnsi"/>
+              </w:rPr>
+              <w:t>Trench Coat</w:t>
+            </w:r>
+          </w:p>
+        </w:tc>
+        <w:tc>
+          <w:tcPr>
+            <w:tcW w:w="2509" w:type="dxa"/>
+            <w:tcBorders>
+              <w:bottom w:val="single" w:sz="4" w:space="0" w:color="auto"/>
+            </w:tcBorders>
+          </w:tcPr>
+          <w:p>
+            <w:pPr>
+              <w:rPr>
+                <w:rFonts w:asciiTheme="majorHAnsi" w:hAnsiTheme="majorHAnsi" w:cstheme="minorHAnsi"/>
+              </w:rPr>
+            </w:pPr>
+            <w:r>
+              <w:rPr>
+                <w:rFonts w:asciiTheme="majorHAnsi" w:hAnsiTheme="majorHAnsi" w:cstheme="minorHAnsi"/>
+              </w:rPr>
+              <w:t>Very Rare</w:t>
+            </w:r>
+          </w:p>
+        </w:tc>
+        <w:tc>
+          <w:tcPr>
+            <w:tcW w:w="2261" w:type="dxa"/>
+          </w:tcPr>
+          <w:p>
+            <w:pPr>
+              <w:rPr>
+                <w:rFonts w:asciiTheme="majorHAnsi" w:hAnsiTheme="majorHAnsi" w:cstheme="minorHAnsi"/>
+              </w:rPr>
+            </w:pPr>
+            <w:r>
+              <w:rPr>
+                <w:rFonts w:asciiTheme="majorHAnsi" w:hAnsiTheme="majorHAnsi" w:cstheme="minorHAnsi"/>
+              </w:rPr>
+              <w:t>Long Jacket that keeps the player somewhat warm and helps keep them safe from the rain. Usually made from leather</w:t>
+            </w:r>
+          </w:p>
+          <w:p>
+            <w:pPr>
+              <w:rPr>
+                <w:rFonts w:asciiTheme="majorHAnsi" w:hAnsiTheme="majorHAnsi" w:cstheme="minorHAnsi"/>
+              </w:rPr>
+            </w:pPr>
+          </w:p>
+          <w:p>
+            <w:pPr>
+              <w:rPr>
+                <w:rFonts w:asciiTheme="majorHAnsi" w:hAnsiTheme="majorHAnsi" w:cstheme="minorHAnsi"/>
+              </w:rPr>
+            </w:pPr>
+            <w:r>
+              <w:rPr>
+                <w:rFonts w:asciiTheme="majorHAnsi" w:hAnsiTheme="majorHAnsi" w:cstheme="minorHAnsi"/>
+              </w:rPr>
+              <w:t>Noisy, Bite resistant</w:t>
+            </w:r>
+          </w:p>
+        </w:tc>
+        <w:tc>
+          <w:tcPr>
+            <w:tcW w:w="2224" w:type="dxa"/>
+          </w:tcPr>
+          <w:p>
+            <w:pPr>
+              <w:rPr>
+                <w:rFonts w:asciiTheme="majorHAnsi" w:hAnsiTheme="majorHAnsi" w:cstheme="minorHAnsi"/>
+              </w:rPr>
+            </w:pPr>
+            <w:r>
+              <w:rPr>
+                <w:rFonts w:asciiTheme="majorHAnsi" w:hAnsiTheme="majorHAnsi" w:cstheme="minorHAnsi"/>
+              </w:rPr>
+              <w:t>Storage: Low</w:t>
+            </w:r>
+          </w:p>
+          <w:p>
+            <w:pPr>
+              <w:rPr>
+                <w:rFonts w:asciiTheme="majorHAnsi" w:hAnsiTheme="majorHAnsi" w:cstheme="minorHAnsi"/>
+              </w:rPr>
+            </w:pPr>
+          </w:p>
+          <w:p>
+            <w:pPr>
+              <w:rPr>
+                <w:rFonts w:asciiTheme="majorHAnsi" w:hAnsiTheme="majorHAnsi" w:cstheme="minorHAnsi"/>
+              </w:rPr>
+            </w:pPr>
+            <w:r>
+              <w:rPr>
+                <w:rFonts w:asciiTheme="majorHAnsi" w:hAnsiTheme="majorHAnsi" w:cstheme="minorHAnsi"/>
+              </w:rPr>
+              <w:t>AR: 5</w:t>
+            </w:r>
+          </w:p>
+          <w:p>
+            <w:pPr>
+              <w:rPr>
+                <w:rFonts w:asciiTheme="majorHAnsi" w:hAnsiTheme="majorHAnsi" w:cstheme="minorHAnsi"/>
+              </w:rPr>
+            </w:pPr>
+          </w:p>
+          <w:p>
+            <w:pPr>
+              <w:rPr>
+                <w:rFonts w:asciiTheme="majorHAnsi" w:hAnsiTheme="majorHAnsi" w:cstheme="minorHAnsi"/>
+              </w:rPr>
+            </w:pPr>
+            <w:r>
+              <w:rPr>
+                <w:rFonts w:asciiTheme="majorHAnsi" w:hAnsiTheme="majorHAnsi" w:cstheme="minorHAnsi"/>
+              </w:rPr>
+              <w:t>Weight Rating: 4</w:t>
+            </w:r>
+          </w:p>
+        </w:tc>
+      </w:tr>
+      <w:tr>
+        <w:tc>
+          <w:tcPr>
+            <w:tcW w:w="2582" w:type="dxa"/>
+            <w:tcBorders>
+              <w:bottom w:val="single" w:sz="4" w:space="0" w:color="auto"/>
+            </w:tcBorders>
+          </w:tcPr>
+          <w:p>
+            <w:pPr>
+              <w:rPr>
+                <w:rFonts w:asciiTheme="majorHAnsi" w:hAnsiTheme="majorHAnsi" w:cstheme="minorHAnsi"/>
+              </w:rPr>
+            </w:pPr>
+            <w:r>
+              <w:rPr>
+                <w:rFonts w:asciiTheme="majorHAnsi" w:hAnsiTheme="majorHAnsi" w:cstheme="minorHAnsi"/>
+              </w:rPr>
+              <w:t>Leather Jacket</w:t>
+            </w:r>
+          </w:p>
+        </w:tc>
+        <w:tc>
+          <w:tcPr>
+            <w:tcW w:w="2509" w:type="dxa"/>
+            <w:tcBorders>
+              <w:bottom w:val="single" w:sz="4" w:space="0" w:color="auto"/>
+            </w:tcBorders>
+          </w:tcPr>
+          <w:p>
+            <w:pPr>
+              <w:rPr>
+                <w:rFonts w:asciiTheme="majorHAnsi" w:hAnsiTheme="majorHAnsi" w:cstheme="minorHAnsi"/>
+              </w:rPr>
+            </w:pPr>
+            <w:r>
+              <w:rPr>
+                <w:rFonts w:asciiTheme="majorHAnsi" w:hAnsiTheme="majorHAnsi" w:cstheme="minorHAnsi"/>
+              </w:rPr>
+              <w:t>Very Rare</w:t>
+            </w:r>
+          </w:p>
+        </w:tc>
+        <w:tc>
+          <w:tcPr>
+            <w:tcW w:w="2261" w:type="dxa"/>
+          </w:tcPr>
+          <w:p>
+            <w:pPr>
+              <w:rPr>
+                <w:rFonts w:asciiTheme="majorHAnsi" w:hAnsiTheme="majorHAnsi" w:cstheme="minorHAnsi"/>
+              </w:rPr>
+            </w:pPr>
+            <w:r>
+              <w:rPr>
+                <w:rFonts w:asciiTheme="majorHAnsi" w:hAnsiTheme="majorHAnsi" w:cstheme="minorHAnsi"/>
+              </w:rPr>
+              <w:t xml:space="preserve">Jacket made from thick leather, keeps the player warm and protects against </w:t>
+            </w:r>
+            <w:proofErr w:type="gramStart"/>
+            <w:r>
+              <w:rPr>
+                <w:rFonts w:asciiTheme="majorHAnsi" w:hAnsiTheme="majorHAnsi" w:cstheme="minorHAnsi"/>
+              </w:rPr>
+              <w:t>enemies</w:t>
+            </w:r>
+            <w:proofErr w:type="gramEnd"/>
+            <w:r>
+              <w:rPr>
+                <w:rFonts w:asciiTheme="majorHAnsi" w:hAnsiTheme="majorHAnsi" w:cstheme="minorHAnsi"/>
+              </w:rPr>
+              <w:t xml:space="preserve"> bites</w:t>
+            </w:r>
+          </w:p>
+          <w:p>
+            <w:pPr>
+              <w:rPr>
+                <w:rFonts w:asciiTheme="majorHAnsi" w:hAnsiTheme="majorHAnsi" w:cstheme="minorHAnsi"/>
+              </w:rPr>
+            </w:pPr>
+          </w:p>
+          <w:p>
+            <w:pPr>
+              <w:rPr>
+                <w:rFonts w:asciiTheme="majorHAnsi" w:hAnsiTheme="majorHAnsi" w:cstheme="minorHAnsi"/>
+              </w:rPr>
+            </w:pPr>
+            <w:r>
+              <w:rPr>
+                <w:rFonts w:asciiTheme="majorHAnsi" w:hAnsiTheme="majorHAnsi" w:cstheme="minorHAnsi"/>
+              </w:rPr>
+              <w:t>Noisy, Bite Resistant</w:t>
+            </w:r>
+          </w:p>
+        </w:tc>
+        <w:tc>
+          <w:tcPr>
+            <w:tcW w:w="2224" w:type="dxa"/>
+          </w:tcPr>
+          <w:p>
+            <w:pPr>
+              <w:rPr>
+                <w:rFonts w:asciiTheme="majorHAnsi" w:hAnsiTheme="majorHAnsi" w:cstheme="minorHAnsi"/>
+              </w:rPr>
+            </w:pPr>
+            <w:r>
+              <w:rPr>
+                <w:rFonts w:asciiTheme="majorHAnsi" w:hAnsiTheme="majorHAnsi" w:cstheme="minorHAnsi"/>
+              </w:rPr>
+              <w:t>Storage</w:t>
+            </w:r>
+            <w:r>
+              <w:rPr>
+                <w:rFonts w:asciiTheme="majorHAnsi" w:hAnsiTheme="majorHAnsi" w:cstheme="minorHAnsi"/>
+              </w:rPr>
+              <w:t>:</w:t>
+            </w:r>
+            <w:r>
+              <w:rPr>
+                <w:rFonts w:asciiTheme="majorHAnsi" w:hAnsiTheme="majorHAnsi" w:cstheme="minorHAnsi"/>
+              </w:rPr>
+              <w:t xml:space="preserve"> Low</w:t>
+            </w:r>
+          </w:p>
+          <w:p>
+            <w:pPr>
+              <w:rPr>
+                <w:rFonts w:asciiTheme="majorHAnsi" w:hAnsiTheme="majorHAnsi" w:cstheme="minorHAnsi"/>
+              </w:rPr>
+            </w:pPr>
+          </w:p>
+          <w:p>
+            <w:pPr>
+              <w:rPr>
+                <w:rFonts w:asciiTheme="majorHAnsi" w:hAnsiTheme="majorHAnsi" w:cstheme="minorHAnsi"/>
+              </w:rPr>
+            </w:pPr>
+            <w:r>
+              <w:rPr>
+                <w:rFonts w:asciiTheme="majorHAnsi" w:hAnsiTheme="majorHAnsi" w:cstheme="minorHAnsi"/>
+              </w:rPr>
+              <w:t>AR: 4</w:t>
+            </w:r>
+          </w:p>
+          <w:p>
+            <w:pPr>
+              <w:rPr>
+                <w:rFonts w:asciiTheme="majorHAnsi" w:hAnsiTheme="majorHAnsi" w:cstheme="minorHAnsi"/>
+              </w:rPr>
+            </w:pPr>
+          </w:p>
+          <w:p>
+            <w:pPr>
+              <w:rPr>
+                <w:rFonts w:asciiTheme="majorHAnsi" w:hAnsiTheme="majorHAnsi" w:cstheme="minorHAnsi"/>
+              </w:rPr>
+            </w:pPr>
+            <w:r>
+              <w:rPr>
+                <w:rFonts w:asciiTheme="majorHAnsi" w:hAnsiTheme="majorHAnsi" w:cstheme="minorHAnsi"/>
+              </w:rPr>
+              <w:t>Weight Rating: 3</w:t>
+            </w:r>
+          </w:p>
+        </w:tc>
+      </w:tr>
+      <w:tr>
+        <w:tc>
+          <w:tcPr>
+            <w:tcW w:w="2582" w:type="dxa"/>
+            <w:tcBorders>
+              <w:bottom w:val="single" w:sz="4" w:space="0" w:color="auto"/>
+            </w:tcBorders>
+          </w:tcPr>
+          <w:p>
+            <w:pPr>
+              <w:rPr>
+                <w:rFonts w:asciiTheme="majorHAnsi" w:hAnsiTheme="majorHAnsi" w:cstheme="minorHAnsi"/>
+              </w:rPr>
+            </w:pPr>
+            <w:r>
+              <w:rPr>
+                <w:rFonts w:asciiTheme="majorHAnsi" w:hAnsiTheme="majorHAnsi" w:cstheme="minorHAnsi"/>
+              </w:rPr>
+              <w:t>Jacket</w:t>
+            </w:r>
+          </w:p>
+        </w:tc>
+        <w:tc>
+          <w:tcPr>
+            <w:tcW w:w="2509" w:type="dxa"/>
+            <w:tcBorders>
+              <w:bottom w:val="single" w:sz="4" w:space="0" w:color="auto"/>
+            </w:tcBorders>
+          </w:tcPr>
+          <w:p>
+            <w:pPr>
+              <w:rPr>
+                <w:rFonts w:asciiTheme="majorHAnsi" w:hAnsiTheme="majorHAnsi" w:cstheme="minorHAnsi"/>
+              </w:rPr>
+            </w:pPr>
+            <w:r>
+              <w:rPr>
+                <w:rFonts w:asciiTheme="majorHAnsi" w:hAnsiTheme="majorHAnsi" w:cstheme="minorHAnsi"/>
+              </w:rPr>
+              <w:t>Uncommon</w:t>
+            </w:r>
+          </w:p>
+        </w:tc>
+        <w:tc>
+          <w:tcPr>
+            <w:tcW w:w="2261" w:type="dxa"/>
+          </w:tcPr>
+          <w:p>
+            <w:pPr>
+              <w:rPr>
+                <w:rFonts w:asciiTheme="majorHAnsi" w:hAnsiTheme="majorHAnsi" w:cstheme="minorHAnsi"/>
+              </w:rPr>
+            </w:pPr>
+            <w:r>
+              <w:rPr>
+                <w:rFonts w:asciiTheme="majorHAnsi" w:hAnsiTheme="majorHAnsi" w:cstheme="minorHAnsi"/>
+              </w:rPr>
+              <w:t>Generic Cotton jacket, helps against the cold somewhat but more of a stylish/storage thing</w:t>
+            </w:r>
+          </w:p>
+        </w:tc>
+        <w:tc>
+          <w:tcPr>
+            <w:tcW w:w="2224" w:type="dxa"/>
+          </w:tcPr>
+          <w:p>
+            <w:pPr>
+              <w:rPr>
+                <w:rFonts w:asciiTheme="majorHAnsi" w:hAnsiTheme="majorHAnsi" w:cstheme="minorHAnsi"/>
+              </w:rPr>
+            </w:pPr>
+            <w:r>
+              <w:rPr>
+                <w:rFonts w:asciiTheme="majorHAnsi" w:hAnsiTheme="majorHAnsi" w:cstheme="minorHAnsi"/>
+              </w:rPr>
+              <w:t>Storage: Low</w:t>
+            </w:r>
+          </w:p>
+          <w:p>
+            <w:pPr>
+              <w:rPr>
+                <w:rFonts w:asciiTheme="majorHAnsi" w:hAnsiTheme="majorHAnsi" w:cstheme="minorHAnsi"/>
+              </w:rPr>
+            </w:pPr>
+          </w:p>
+          <w:p>
+            <w:pPr>
+              <w:rPr>
+                <w:rFonts w:asciiTheme="majorHAnsi" w:hAnsiTheme="majorHAnsi" w:cstheme="minorHAnsi"/>
+              </w:rPr>
+            </w:pPr>
+            <w:r>
+              <w:rPr>
+                <w:rFonts w:asciiTheme="majorHAnsi" w:hAnsiTheme="majorHAnsi" w:cstheme="minorHAnsi"/>
+              </w:rPr>
+              <w:t>AR: 1</w:t>
+            </w:r>
+          </w:p>
+        </w:tc>
+      </w:tr>
+      <w:tr>
+        <w:tc>
+          <w:tcPr>
+            <w:tcW w:w="2582" w:type="dxa"/>
+            <w:tcBorders>
+              <w:bottom w:val="single" w:sz="4" w:space="0" w:color="auto"/>
+            </w:tcBorders>
+          </w:tcPr>
+          <w:p>
+            <w:pPr>
+              <w:rPr>
+                <w:rFonts w:asciiTheme="majorHAnsi" w:hAnsiTheme="majorHAnsi" w:cstheme="minorHAnsi"/>
+              </w:rPr>
+            </w:pPr>
+            <w:r>
+              <w:rPr>
+                <w:rFonts w:asciiTheme="majorHAnsi" w:hAnsiTheme="majorHAnsi" w:cstheme="minorHAnsi"/>
+              </w:rPr>
+              <w:t>Hoodie</w:t>
+            </w:r>
+          </w:p>
+        </w:tc>
+        <w:tc>
+          <w:tcPr>
+            <w:tcW w:w="2509" w:type="dxa"/>
+            <w:tcBorders>
+              <w:bottom w:val="single" w:sz="4" w:space="0" w:color="auto"/>
+            </w:tcBorders>
+          </w:tcPr>
+          <w:p>
+            <w:pPr>
+              <w:rPr>
+                <w:rFonts w:asciiTheme="majorHAnsi" w:hAnsiTheme="majorHAnsi" w:cstheme="minorHAnsi"/>
+              </w:rPr>
+            </w:pPr>
+            <w:r>
+              <w:rPr>
+                <w:rFonts w:asciiTheme="majorHAnsi" w:hAnsiTheme="majorHAnsi" w:cstheme="minorHAnsi"/>
+              </w:rPr>
+              <w:t>Uncommon</w:t>
+            </w:r>
+          </w:p>
+        </w:tc>
+        <w:tc>
+          <w:tcPr>
+            <w:tcW w:w="2261" w:type="dxa"/>
+          </w:tcPr>
+          <w:p>
+            <w:pPr>
+              <w:rPr>
+                <w:rFonts w:asciiTheme="majorHAnsi" w:hAnsiTheme="majorHAnsi" w:cstheme="minorHAnsi"/>
+              </w:rPr>
+            </w:pPr>
+            <w:r>
+              <w:rPr>
+                <w:rFonts w:asciiTheme="majorHAnsi" w:hAnsiTheme="majorHAnsi" w:cstheme="minorHAnsi"/>
+              </w:rPr>
+              <w:t>Generic Hoodie, protects against cold</w:t>
+            </w:r>
+          </w:p>
+        </w:tc>
+        <w:tc>
+          <w:tcPr>
+            <w:tcW w:w="2224" w:type="dxa"/>
+          </w:tcPr>
+          <w:p>
+            <w:pPr>
+              <w:rPr>
+                <w:rFonts w:asciiTheme="majorHAnsi" w:hAnsiTheme="majorHAnsi" w:cstheme="minorHAnsi"/>
+              </w:rPr>
+            </w:pPr>
+            <w:r>
+              <w:rPr>
+                <w:rFonts w:asciiTheme="majorHAnsi" w:hAnsiTheme="majorHAnsi" w:cstheme="minorHAnsi"/>
+              </w:rPr>
+              <w:t>Storage: Very Low</w:t>
+            </w:r>
+          </w:p>
+          <w:p>
+            <w:pPr>
+              <w:rPr>
+                <w:rFonts w:asciiTheme="majorHAnsi" w:hAnsiTheme="majorHAnsi" w:cstheme="minorHAnsi"/>
+              </w:rPr>
+            </w:pPr>
+          </w:p>
+          <w:p>
+            <w:pPr>
+              <w:rPr>
+                <w:rFonts w:asciiTheme="majorHAnsi" w:hAnsiTheme="majorHAnsi" w:cstheme="minorHAnsi"/>
+              </w:rPr>
+            </w:pPr>
+            <w:r>
+              <w:rPr>
+                <w:rFonts w:asciiTheme="majorHAnsi" w:hAnsiTheme="majorHAnsi" w:cstheme="minorHAnsi"/>
+              </w:rPr>
+              <w:t>AR: 1</w:t>
+            </w:r>
+          </w:p>
+        </w:tc>
+      </w:tr>
+      <w:tr>
+        <w:trPr>
           <w:trHeight w:val="374"/>
         </w:trPr>
         <w:tc>
@@ -17423,7 +20956,6 @@
                 <w:rFonts w:asciiTheme="majorHAnsi" w:hAnsiTheme="majorHAnsi" w:cstheme="minorHAnsi"/>
                 <w:b/>
               </w:rPr>
-              <w:lastRenderedPageBreak/>
               <w:t>Enemies, NPCs, and animals</w:t>
             </w:r>
           </w:p>
@@ -17660,6 +21192,7 @@
               <w:rPr>
                 <w:rFonts w:asciiTheme="majorHAnsi" w:hAnsiTheme="majorHAnsi" w:cstheme="minorHAnsi"/>
               </w:rPr>
+              <w:lastRenderedPageBreak/>
               <w:t>Shedder</w:t>
             </w:r>
           </w:p>
@@ -17785,14 +21318,7 @@
               <w:rPr>
                 <w:rFonts w:asciiTheme="majorHAnsi" w:hAnsiTheme="majorHAnsi" w:cstheme="minorHAnsi"/>
               </w:rPr>
-              <w:t xml:space="preserve"> like the Demogorgon from “stranger things” revealing the skull and muscle </w:t>
-            </w:r>
-            <w:r>
-              <w:rPr>
-                <w:rFonts w:asciiTheme="majorHAnsi" w:hAnsiTheme="majorHAnsi" w:cstheme="minorHAnsi"/>
-              </w:rPr>
-              <w:lastRenderedPageBreak/>
-              <w:t xml:space="preserve">underneath. During this animation they spit </w:t>
+              <w:t xml:space="preserve"> like the Demogorgon from “stranger things” revealing the skull and muscle underneath. During this animation they spit </w:t>
             </w:r>
             <w:proofErr w:type="gramStart"/>
             <w:r>
@@ -17901,7 +21427,14 @@
               <w:rPr>
                 <w:rFonts w:asciiTheme="majorHAnsi" w:hAnsiTheme="majorHAnsi" w:cstheme="minorHAnsi"/>
               </w:rPr>
-              <w:t xml:space="preserve"> the mutagen has caused their limbs to extend over time to adapt </w:t>
+              <w:t xml:space="preserve"> the </w:t>
+            </w:r>
+            <w:r>
+              <w:rPr>
+                <w:rFonts w:asciiTheme="majorHAnsi" w:hAnsiTheme="majorHAnsi" w:cstheme="minorHAnsi"/>
+              </w:rPr>
+              <w:lastRenderedPageBreak/>
+              <w:t xml:space="preserve">mutagen has caused their limbs to extend over time to adapt </w:t>
             </w:r>
             <w:r>
               <w:rPr>
@@ -18026,14 +21559,7 @@
               <w:rPr>
                 <w:rFonts w:asciiTheme="majorHAnsi" w:hAnsiTheme="majorHAnsi" w:cstheme="minorHAnsi"/>
               </w:rPr>
-              <w:t xml:space="preserve">An infected bear, notorious for being a bullet sponge, like a normal bear already wasn’t a tank, targeting exposed tissue, </w:t>
-            </w:r>
-            <w:r>
-              <w:rPr>
-                <w:rFonts w:asciiTheme="majorHAnsi" w:hAnsiTheme="majorHAnsi" w:cstheme="minorHAnsi"/>
-              </w:rPr>
-              <w:lastRenderedPageBreak/>
-              <w:t>bones and the brain will help take this beast down</w:t>
+              <w:t>An infected bear, notorious for being a bullet sponge, like a normal bear already wasn’t a tank, targeting exposed tissue, bones and the brain will help take this beast down</w:t>
             </w:r>
           </w:p>
         </w:tc>
@@ -18181,7 +21707,14 @@
               <w:rPr>
                 <w:rFonts w:asciiTheme="majorHAnsi" w:hAnsiTheme="majorHAnsi" w:cstheme="minorHAnsi"/>
               </w:rPr>
-              <w:t>Infected that have a malformed head that resembles coral, makes it harder to kill in one shot to the head, targeting the limbs is advised. They are blind and deaf and feel around in their environment for prey, making them dangerous scouts in enclosed areas. They often get stuck in crawl spaces like caves, vents, etc.</w:t>
+              <w:t xml:space="preserve">Infected that have a malformed head that resembles coral, makes it harder to kill in one shot to the head, targeting the limbs is advised. They are blind and deaf and feel around in their </w:t>
+            </w:r>
+            <w:r>
+              <w:rPr>
+                <w:rFonts w:asciiTheme="majorHAnsi" w:hAnsiTheme="majorHAnsi" w:cstheme="minorHAnsi"/>
+              </w:rPr>
+              <w:lastRenderedPageBreak/>
+              <w:t>environment for prey, making them dangerous scouts in enclosed areas. They often get stuck in crawl spaces like caves, vents, etc.</w:t>
             </w:r>
           </w:p>
         </w:tc>
@@ -18576,19 +22109,7 @@
         <w:rPr>
           <w:rFonts w:cstheme="minorHAnsi"/>
         </w:rPr>
-        <w:t>Safe houses are designed to give players a mental break</w:t>
-      </w:r>
-      <w:r>
-        <w:rPr>
-          <w:rFonts w:cstheme="minorHAnsi"/>
-        </w:rPr>
-        <w:t xml:space="preserve">, </w:t>
-      </w:r>
-      <w:r>
-        <w:rPr>
-          <w:rFonts w:cstheme="minorHAnsi"/>
-        </w:rPr>
-        <w:t xml:space="preserve">a moment to decompress from the constant tension, </w:t>
+        <w:t xml:space="preserve">Safe houses are designed to give players a mental break, a moment to decompress from the constant tension, </w:t>
       </w:r>
       <w:proofErr w:type="gramStart"/>
       <w:r>
@@ -18695,19 +22216,7 @@
         <w:rPr>
           <w:rFonts w:cstheme="minorHAnsi"/>
         </w:rPr>
-        <w:t xml:space="preserve">Levels are filled with a variety of hazards spread across the map, including environmental dangers, traps, and weather effects. For example, a swamp might feature thick mud that increases the chance of weapon jams, while a water treatment plant could have </w:t>
-      </w:r>
-      <w:r>
-        <w:rPr>
-          <w:rFonts w:cstheme="minorHAnsi"/>
-        </w:rPr>
-        <w:t>large, submerged</w:t>
-      </w:r>
-      <w:r>
-        <w:rPr>
-          <w:rFonts w:cstheme="minorHAnsi"/>
-        </w:rPr>
-        <w:t xml:space="preserve"> areas that require swimming. (See the Hazards list under Mechanics for more detail.)</w:t>
+        <w:t>Levels are filled with a variety of hazards spread across the map, including environmental dangers, traps, and weather effects. For example, a swamp might feature thick mud that increases the chance of weapon jams, while a water treatment plant could have large, submerged areas that require swimming. (See the Hazards list under Mechanics for more detail.)</w:t>
       </w:r>
     </w:p>
     <w:p>
@@ -21087,7 +24596,7 @@
                       <a:effectLst/>
                       <a:extLst>
                         <a:ext uri="{C572A759-6A51-4108-AA02-DFA0A04FC94B}">
-                          <ma14:wrappingTextBoxFlag xmlns:ma14="http://schemas.microsoft.com/office/mac/drawingml/2011/main" xmlns:w="http://schemas.openxmlformats.org/wordprocessingml/2006/main" xmlns:w10="urn:schemas-microsoft-com:office:word" xmlns:v="urn:schemas-microsoft-com:vml" xmlns:o="urn:schemas-microsoft-com:office:office" xmlns:mv="urn:schemas-microsoft-com:mac:vml" xmlns:mo="http://schemas.microsoft.com/office/mac/office/2008/main" xmlns="" xmlns:arto="http://schemas.microsoft.com/office/word/2006/arto"/>
+                          <ma14:wrappingTextBoxFlag xmlns:arto="http://schemas.microsoft.com/office/word/2006/arto" xmlns="" xmlns:mo="http://schemas.microsoft.com/office/mac/office/2008/main" xmlns:mv="urn:schemas-microsoft-com:mac:vml" xmlns:o="urn:schemas-microsoft-com:office:office" xmlns:v="urn:schemas-microsoft-com:vml" xmlns:w10="urn:schemas-microsoft-com:office:word" xmlns:w="http://schemas.openxmlformats.org/wordprocessingml/2006/main" xmlns:ma14="http://schemas.microsoft.com/office/mac/drawingml/2011/main"/>
                         </a:ext>
                       </a:extLst>
                     </wps:spPr>
@@ -21551,7 +25060,7 @@
                       <a:effectLst/>
                       <a:extLst>
                         <a:ext uri="{C572A759-6A51-4108-AA02-DFA0A04FC94B}">
-                          <ma14:wrappingTextBoxFlag xmlns:ma14="http://schemas.microsoft.com/office/mac/drawingml/2011/main" xmlns:w="http://schemas.openxmlformats.org/wordprocessingml/2006/main" xmlns:w10="urn:schemas-microsoft-com:office:word" xmlns:v="urn:schemas-microsoft-com:vml" xmlns:o="urn:schemas-microsoft-com:office:office" xmlns:mv="urn:schemas-microsoft-com:mac:vml" xmlns:mo="http://schemas.microsoft.com/office/mac/office/2008/main" xmlns="" xmlns:arto="http://schemas.microsoft.com/office/word/2006/arto"/>
+                          <ma14:wrappingTextBoxFlag xmlns:arto="http://schemas.microsoft.com/office/word/2006/arto" xmlns="" xmlns:mo="http://schemas.microsoft.com/office/mac/office/2008/main" xmlns:mv="urn:schemas-microsoft-com:mac:vml" xmlns:o="urn:schemas-microsoft-com:office:office" xmlns:v="urn:schemas-microsoft-com:vml" xmlns:w10="urn:schemas-microsoft-com:office:word" xmlns:w="http://schemas.openxmlformats.org/wordprocessingml/2006/main" xmlns:ma14="http://schemas.microsoft.com/office/mac/drawingml/2011/main"/>
                         </a:ext>
                       </a:extLst>
                     </wps:spPr>
@@ -21739,7 +25248,7 @@
                       <a:effectLst/>
                       <a:extLst>
                         <a:ext uri="{C572A759-6A51-4108-AA02-DFA0A04FC94B}">
-                          <ma14:wrappingTextBoxFlag xmlns:ma14="http://schemas.microsoft.com/office/mac/drawingml/2011/main" xmlns:w="http://schemas.openxmlformats.org/wordprocessingml/2006/main" xmlns:w10="urn:schemas-microsoft-com:office:word" xmlns:v="urn:schemas-microsoft-com:vml" xmlns:o="urn:schemas-microsoft-com:office:office" xmlns:mv="urn:schemas-microsoft-com:mac:vml" xmlns:mo="http://schemas.microsoft.com/office/mac/office/2008/main" xmlns="" xmlns:arto="http://schemas.microsoft.com/office/word/2006/arto"/>
+                          <ma14:wrappingTextBoxFlag xmlns:arto="http://schemas.microsoft.com/office/word/2006/arto" xmlns="" xmlns:mo="http://schemas.microsoft.com/office/mac/office/2008/main" xmlns:mv="urn:schemas-microsoft-com:mac:vml" xmlns:o="urn:schemas-microsoft-com:office:office" xmlns:v="urn:schemas-microsoft-com:vml" xmlns:w10="urn:schemas-microsoft-com:office:word" xmlns:w="http://schemas.openxmlformats.org/wordprocessingml/2006/main" xmlns:ma14="http://schemas.microsoft.com/office/mac/drawingml/2011/main"/>
                         </a:ext>
                       </a:extLst>
                     </wps:spPr>
@@ -21880,7 +25389,7 @@
                       <a:effectLst/>
                       <a:extLst>
                         <a:ext uri="{C572A759-6A51-4108-AA02-DFA0A04FC94B}">
-                          <ma14:wrappingTextBoxFlag xmlns:ma14="http://schemas.microsoft.com/office/mac/drawingml/2011/main" xmlns:w="http://schemas.openxmlformats.org/wordprocessingml/2006/main" xmlns:w10="urn:schemas-microsoft-com:office:word" xmlns:v="urn:schemas-microsoft-com:vml" xmlns:o="urn:schemas-microsoft-com:office:office" xmlns:mv="urn:schemas-microsoft-com:mac:vml" xmlns:mo="http://schemas.microsoft.com/office/mac/office/2008/main" xmlns="" xmlns:arto="http://schemas.microsoft.com/office/word/2006/arto"/>
+                          <ma14:wrappingTextBoxFlag xmlns:arto="http://schemas.microsoft.com/office/word/2006/arto" xmlns="" xmlns:mo="http://schemas.microsoft.com/office/mac/office/2008/main" xmlns:mv="urn:schemas-microsoft-com:mac:vml" xmlns:o="urn:schemas-microsoft-com:office:office" xmlns:v="urn:schemas-microsoft-com:vml" xmlns:w10="urn:schemas-microsoft-com:office:word" xmlns:w="http://schemas.openxmlformats.org/wordprocessingml/2006/main" xmlns:ma14="http://schemas.microsoft.com/office/mac/drawingml/2011/main"/>
                         </a:ext>
                       </a:extLst>
                     </wps:spPr>
@@ -22006,7 +25515,7 @@
                       <a:effectLst/>
                       <a:extLst>
                         <a:ext uri="{C572A759-6A51-4108-AA02-DFA0A04FC94B}">
-                          <ma14:wrappingTextBoxFlag xmlns:ma14="http://schemas.microsoft.com/office/mac/drawingml/2011/main" xmlns:w="http://schemas.openxmlformats.org/wordprocessingml/2006/main" xmlns:w10="urn:schemas-microsoft-com:office:word" xmlns:v="urn:schemas-microsoft-com:vml" xmlns:o="urn:schemas-microsoft-com:office:office" xmlns:mv="urn:schemas-microsoft-com:mac:vml" xmlns:mo="http://schemas.microsoft.com/office/mac/office/2008/main" xmlns="" xmlns:arto="http://schemas.microsoft.com/office/word/2006/arto"/>
+                          <ma14:wrappingTextBoxFlag xmlns:arto="http://schemas.microsoft.com/office/word/2006/arto" xmlns="" xmlns:mo="http://schemas.microsoft.com/office/mac/office/2008/main" xmlns:mv="urn:schemas-microsoft-com:mac:vml" xmlns:o="urn:schemas-microsoft-com:office:office" xmlns:v="urn:schemas-microsoft-com:vml" xmlns:w10="urn:schemas-microsoft-com:office:word" xmlns:w="http://schemas.openxmlformats.org/wordprocessingml/2006/main" xmlns:ma14="http://schemas.microsoft.com/office/mac/drawingml/2011/main"/>
                         </a:ext>
                       </a:extLst>
                     </wps:spPr>
@@ -23745,7 +27254,7 @@
   <w:style w:type="paragraph" w:default="1" w:styleId="Normal">
     <w:name w:val="Normal"/>
     <w:qFormat/>
-    <w:rsid w:val="008B7733"/>
+    <w:rsid w:val="00505C43"/>
   </w:style>
   <w:style w:type="paragraph" w:styleId="Heading1">
     <w:name w:val="heading 1"/>
@@ -23794,6 +27303,7 @@
   <w:style w:type="character" w:default="1" w:styleId="DefaultParagraphFont">
     <w:name w:val="Default Paragraph Font"/>
     <w:uiPriority w:val="1"/>
+    <w:semiHidden/>
     <w:unhideWhenUsed/>
   </w:style>
   <w:style w:type="table" w:default="1" w:styleId="TableNormal">
@@ -24465,6 +27975,7 @@
     <w:rsid w:val="003D1FA5"/>
     <w:rsid w:val="00446C90"/>
     <w:rsid w:val="00477BB1"/>
+    <w:rsid w:val="00494D97"/>
     <w:rsid w:val="00527DB6"/>
     <w:rsid w:val="0053147E"/>
     <w:rsid w:val="0054430F"/>
@@ -24472,6 +27983,7 @@
     <w:rsid w:val="00642515"/>
     <w:rsid w:val="0065275B"/>
     <w:rsid w:val="00661824"/>
+    <w:rsid w:val="00661D4D"/>
     <w:rsid w:val="00695B51"/>
     <w:rsid w:val="006B449A"/>
     <w:rsid w:val="007432E4"/>
@@ -24484,6 +27996,7 @@
     <w:rsid w:val="0087503D"/>
     <w:rsid w:val="008C5718"/>
     <w:rsid w:val="00904E4F"/>
+    <w:rsid w:val="00957864"/>
     <w:rsid w:val="009E7AF8"/>
     <w:rsid w:val="00A42983"/>
     <w:rsid w:val="00A6449A"/>

</xml_diff>